<commit_message>
adding the Day 05 and Day 06 programs and also the updated html notes
</commit_message>
<xml_diff>
--- a/HTML/HTML Notes Scratch to pro..docx
+++ b/HTML/HTML Notes Scratch to pro..docx
@@ -150,10 +150,7 @@
       </w:r>
       <w:proofErr w:type="spellEnd"/>
       <w:r>
-        <w:t xml:space="preserve"> markup language “.Basi</w:t>
-      </w:r>
-      <w:r>
-        <w:t>cally the html is used to design the front    structure of any of the website .</w:t>
+        <w:t xml:space="preserve"> markup language “.Basically the html is used to design the front    structure of any of the website .</w:t>
       </w:r>
     </w:p>
     <w:p>
@@ -207,10 +204,7 @@
       </w:r>
       <w:proofErr w:type="gramEnd"/>
       <w:r>
-        <w:t>, a</w:t>
-      </w:r>
-      <w:r>
-        <w:t>nd a closing tag.</w:t>
+        <w:t>, and a closing tag.</w:t>
       </w:r>
     </w:p>
     <w:p>
@@ -242,10 +236,7 @@
         <w:spacing w:before="200"/>
       </w:pPr>
       <w:r>
-        <w:t>Html tags are the container for the some content .we can put the one container inside the other container and th</w:t>
-      </w:r>
-      <w:r>
-        <w:t xml:space="preserve">en put the content which we want to </w:t>
+        <w:t xml:space="preserve">Html tags are the container for the some content .we can put the one container inside the other container and then put the content which we want to </w:t>
       </w:r>
       <w:proofErr w:type="gramStart"/>
       <w:r>
@@ -354,13 +345,7 @@
         <w:rPr>
           <w:color w:val="434343"/>
         </w:rPr>
-        <w:t>The &lt;p&gt; at the start is called opening tag and at last</w:t>
-      </w:r>
-      <w:r>
-        <w:rPr>
-          <w:color w:val="434343"/>
-        </w:rPr>
-        <w:t xml:space="preserve"> is called closing </w:t>
+        <w:t xml:space="preserve">The &lt;p&gt; at the start is called opening tag and at last is called closing </w:t>
       </w:r>
       <w:proofErr w:type="gramStart"/>
       <w:r>
@@ -625,13 +610,7 @@
         <w:rPr>
           <w:color w:val="434343"/>
         </w:rPr>
-        <w:t xml:space="preserve"> we go to th</w:t>
-      </w:r>
-      <w:r>
-        <w:rPr>
-          <w:color w:val="434343"/>
-        </w:rPr>
-        <w:t xml:space="preserve">e &lt;h6&gt; </w:t>
+        <w:t xml:space="preserve"> we go to the &lt;h6&gt; </w:t>
       </w:r>
       <w:proofErr w:type="spellStart"/>
       <w:r>
@@ -1020,13 +999,7 @@
         <w:rPr>
           <w:color w:val="434343"/>
         </w:rPr>
-        <w:t xml:space="preserve">        We use the &lt;p&gt;</w:t>
-      </w:r>
-      <w:r>
-        <w:rPr>
-          <w:color w:val="434343"/>
-        </w:rPr>
-        <w:t xml:space="preserve"> for the paragraph writing so we write it like that &lt;p&gt; paragraph&lt;/p</w:t>
+        <w:t xml:space="preserve">        We use the &lt;p&gt; for the paragraph writing so we write it like that &lt;p&gt; paragraph&lt;/p</w:t>
       </w:r>
       <w:proofErr w:type="gramStart"/>
       <w:r>
@@ -1258,16 +1231,7 @@
           <w:sz w:val="21"/>
           <w:szCs w:val="21"/>
         </w:rPr>
-        <w:t xml:space="preserve">&gt;Visit </w:t>
-      </w:r>
-      <w:r>
-        <w:rPr>
-          <w:rFonts w:ascii="Courier New" w:eastAsia="Courier New" w:hAnsi="Courier New" w:cs="Courier New"/>
-          <w:color w:val="FFFFFF"/>
-          <w:sz w:val="21"/>
-          <w:szCs w:val="21"/>
-        </w:rPr>
-        <w:t>Google&lt;/</w:t>
+        <w:t>&gt;Visit Google&lt;/</w:t>
       </w:r>
       <w:r>
         <w:rPr>
@@ -1344,13 +1308,7 @@
         <w:rPr>
           <w:color w:val="434343"/>
         </w:rPr>
-        <w:t xml:space="preserve">  or any social media account related link so we use this tag for link and then at the last where write open the google “ is you c</w:t>
-      </w:r>
-      <w:r>
-        <w:rPr>
-          <w:color w:val="434343"/>
-        </w:rPr>
-        <w:t xml:space="preserve">an say the string which name we choose . </w:t>
+        <w:t xml:space="preserve">  or any social media account related link so we use this tag for link and then at the last where write open the google “ is you can say the string which name we choose . </w:t>
       </w:r>
       <w:proofErr w:type="gramStart"/>
       <w:r>
@@ -1499,8 +1457,9 @@
           <w:color w:val="434343"/>
           <w:u w:val="single"/>
         </w:rPr>
-        <w:t xml:space="preserve"> </w:t>
-      </w:r>
+        <w:t xml:space="preserve"> ,</w:t>
+      </w:r>
+      <w:proofErr w:type="gramEnd"/>
       <w:r>
         <w:rPr>
           <w:b/>
@@ -1508,16 +1467,6 @@
           <w:color w:val="434343"/>
           <w:u w:val="single"/>
         </w:rPr>
-        <w:t>,</w:t>
-      </w:r>
-      <w:proofErr w:type="gramEnd"/>
-      <w:r>
-        <w:rPr>
-          <w:b/>
-          <w:bCs/>
-          <w:color w:val="434343"/>
-          <w:u w:val="single"/>
-        </w:rPr>
         <w:t xml:space="preserve"> 2026</w:t>
       </w:r>
     </w:p>
@@ -1713,10 +1662,7 @@
       </w:r>
       <w:proofErr w:type="spellEnd"/>
       <w:r>
-        <w:t xml:space="preserve"> is the element that is used for</w:t>
-      </w:r>
-      <w:r>
-        <w:t xml:space="preserve"> the images and </w:t>
+        <w:t xml:space="preserve"> is the element that is used for the images and </w:t>
       </w:r>
       <w:proofErr w:type="spellStart"/>
       <w:r>
@@ -2931,10 +2877,7 @@
       </w:r>
       <w:proofErr w:type="spellEnd"/>
       <w:r>
-        <w:t>&gt; for the main heading and &lt;td&gt;</w:t>
-      </w:r>
-      <w:r>
-        <w:t xml:space="preserve"> for the data that we write below the </w:t>
+        <w:t xml:space="preserve">&gt; for the main heading and &lt;td&gt; for the data that we write below the </w:t>
       </w:r>
       <w:proofErr w:type="spellStart"/>
       <w:r>
@@ -3114,10 +3057,7 @@
       </w:r>
       <w:proofErr w:type="spellEnd"/>
       <w:r>
-        <w:t xml:space="preserve"> and mention its size 2 for two rows if more then we can  increase the size by in</w:t>
-      </w:r>
-      <w:r>
-        <w:t>creasing the numbers.</w:t>
+        <w:t xml:space="preserve"> and mention its size 2 for two rows if more then we can  increase the size by increasing the numbers.</w:t>
       </w:r>
     </w:p>
     <w:p/>
@@ -3475,13 +3415,7 @@
         <w:rPr>
           <w:color w:val="FF0000"/>
         </w:rPr>
-        <w:t>Defin</w:t>
-      </w:r>
-      <w:r>
-        <w:rPr>
-          <w:color w:val="FF0000"/>
-        </w:rPr>
-        <w:t>ation</w:t>
+        <w:t>Defination</w:t>
       </w:r>
       <w:proofErr w:type="spellEnd"/>
       <w:r>
@@ -4040,16 +3974,7 @@
           <w:sz w:val="19"/>
           <w:szCs w:val="19"/>
         </w:rPr>
-        <w:t>&gt;</w:t>
-      </w:r>
-      <w:r>
-        <w:rPr>
-          <w:rFonts w:ascii="Courier New" w:eastAsia="Courier New" w:hAnsi="Courier New" w:cs="Courier New"/>
-          <w:color w:val="FFFFFF"/>
-          <w:sz w:val="19"/>
-          <w:szCs w:val="19"/>
-        </w:rPr>
-        <w:t xml:space="preserve">           …………………………………..&gt;&gt; is the example of ordered list.</w:t>
+        <w:t>&gt;           …………………………………..&gt;&gt; is the example of ordered list.</w:t>
       </w:r>
     </w:p>
     <w:p>
@@ -4253,10 +4178,7 @@
       </w:r>
       <w:proofErr w:type="spellEnd"/>
       <w:r>
-        <w:t>” so we got the lower case roma</w:t>
-      </w:r>
-      <w:r>
-        <w:t xml:space="preserve">n numbers. </w:t>
+        <w:t xml:space="preserve">” so we got the lower case roman numbers. </w:t>
       </w:r>
     </w:p>
     <w:p>
@@ -4370,10 +4292,7 @@
       </w:r>
       <w:proofErr w:type="spellEnd"/>
       <w:r>
-        <w:t xml:space="preserve"> its respo</w:t>
-      </w:r>
-      <w:r>
-        <w:t xml:space="preserve">nsibility is that it always show the pages that are fast in progress and fast in loading and show </w:t>
+        <w:t xml:space="preserve"> its responsibility is that it always show the pages that are fast in progress and fast in loading and show </w:t>
       </w:r>
       <w:proofErr w:type="spellStart"/>
       <w:r>
@@ -4397,10 +4316,7 @@
       </w:r>
       <w:proofErr w:type="spellEnd"/>
       <w:r>
-        <w:t xml:space="preserve"> so it always try load the images and content when any of th</w:t>
-      </w:r>
-      <w:r>
-        <w:t>e user interact with the website.</w:t>
+        <w:t xml:space="preserve"> so it always try load the images and content when any of the user interact with the website.</w:t>
       </w:r>
     </w:p>
     <w:p>
@@ -4449,10 +4365,7 @@
         </w:numPr>
       </w:pPr>
       <w:r>
-        <w:t>But one another condition when</w:t>
-      </w:r>
-      <w:r>
-        <w:t xml:space="preserve"> two pages have the similar content then google see the</w:t>
+        <w:t>But one another condition when two pages have the similar content then google see the</w:t>
       </w:r>
       <w:r>
         <w:rPr>
@@ -4506,10 +4419,7 @@
       </w:r>
       <w:proofErr w:type="spellEnd"/>
       <w:r>
-        <w:t xml:space="preserve"> any user vis</w:t>
-      </w:r>
-      <w:r>
-        <w:t xml:space="preserve">it the any website that offer the order of the chairs so he when visit </w:t>
+        <w:t xml:space="preserve"> any user visit the any website that offer the order of the chairs so he when visit </w:t>
       </w:r>
       <w:proofErr w:type="gramStart"/>
       <w:r>
@@ -4565,10 +4475,7 @@
       </w:r>
       <w:proofErr w:type="gramEnd"/>
       <w:r>
-        <w:t xml:space="preserve"> due to l</w:t>
-      </w:r>
-      <w:r>
-        <w:t xml:space="preserve">oading problem the he click at the place of place order </w:t>
+        <w:t xml:space="preserve"> due to loading problem the he click at the place of place order </w:t>
       </w:r>
       <w:proofErr w:type="spellStart"/>
       <w:r>
@@ -4608,10 +4515,7 @@
       </w:r>
       <w:proofErr w:type="spellEnd"/>
       <w:r>
-        <w:t xml:space="preserve"> want. So user got the bad reviews. B</w:t>
-      </w:r>
-      <w:r>
-        <w:t xml:space="preserve">ut this can </w:t>
+        <w:t xml:space="preserve"> want. So user got the bad reviews. But this can </w:t>
       </w:r>
       <w:proofErr w:type="spellStart"/>
       <w:r>
@@ -4663,10 +4567,7 @@
       </w:r>
       <w:proofErr w:type="spellEnd"/>
       <w:r>
-        <w:t xml:space="preserve"> the max time for the largest ele</w:t>
-      </w:r>
-      <w:r>
-        <w:t xml:space="preserve">ment of the </w:t>
+        <w:t xml:space="preserve"> the max time for the largest element of the </w:t>
       </w:r>
       <w:proofErr w:type="gramStart"/>
       <w:r>
@@ -4694,10 +4595,7 @@
       </w:r>
       <w:proofErr w:type="spellEnd"/>
       <w:r>
-        <w:t xml:space="preserve"> it should </w:t>
-      </w:r>
-      <w:r>
-        <w:t>be less than 100milisec to process and give output</w:t>
+        <w:t xml:space="preserve"> it should be less than 100milisec to process and give output</w:t>
       </w:r>
     </w:p>
     <w:p>
@@ -5636,6 +5534,99 @@
       <w:pPr>
         <w:rPr>
           <w:b/>
+          <w:color w:val="4F81BD" w:themeColor="accent1"/>
+        </w:rPr>
+      </w:pPr>
+      <w:r>
+        <w:rPr>
+          <w:b/>
+          <w:color w:val="4F81BD" w:themeColor="accent1"/>
+        </w:rPr>
+        <w:t>.Day _06</w:t>
+      </w:r>
+      <w:proofErr w:type="gramStart"/>
+      <w:r>
+        <w:rPr>
+          <w:b/>
+          <w:color w:val="4F81BD" w:themeColor="accent1"/>
+        </w:rPr>
+        <w:t>:</w:t>
+      </w:r>
+      <w:r>
+        <w:rPr>
+          <w:b/>
+          <w:color w:val="4F81BD" w:themeColor="accent1"/>
+        </w:rPr>
+        <w:t>……..</w:t>
+      </w:r>
+      <w:proofErr w:type="gramEnd"/>
+    </w:p>
+    <w:p>
+      <w:pPr>
+        <w:rPr>
+          <w:b/>
+          <w:color w:val="4F81BD" w:themeColor="accent1"/>
+        </w:rPr>
+      </w:pPr>
+      <w:r>
+        <w:rPr>
+          <w:b/>
+          <w:color w:val="4F81BD" w:themeColor="accent1"/>
+        </w:rPr>
+        <w:t>.22</w:t>
+      </w:r>
+      <w:r>
+        <w:rPr>
+          <w:b/>
+          <w:color w:val="4F81BD" w:themeColor="accent1"/>
+        </w:rPr>
+        <w:t xml:space="preserve"> </w:t>
+      </w:r>
+      <w:proofErr w:type="spellStart"/>
+      <w:proofErr w:type="gramStart"/>
+      <w:r>
+        <w:rPr>
+          <w:b/>
+          <w:color w:val="4F81BD" w:themeColor="accent1"/>
+        </w:rPr>
+        <w:t>sep</w:t>
+      </w:r>
+      <w:proofErr w:type="spellEnd"/>
+      <w:proofErr w:type="gramEnd"/>
+      <w:r>
+        <w:rPr>
+          <w:b/>
+          <w:color w:val="4F81BD" w:themeColor="accent1"/>
+        </w:rPr>
+        <w:t>, 2026</w:t>
+      </w:r>
+      <w:r>
+        <w:rPr>
+          <w:b/>
+          <w:color w:val="4F81BD" w:themeColor="accent1"/>
+        </w:rPr>
+        <w:t>:…….</w:t>
+      </w:r>
+    </w:p>
+    <w:p>
+      <w:pPr>
+        <w:rPr>
+          <w:b/>
+          <w:color w:val="4F81BD" w:themeColor="accent1"/>
+        </w:rPr>
+      </w:pPr>
+      <w:r>
+        <w:rPr>
+          <w:b/>
+          <w:color w:val="4F81BD" w:themeColor="accent1"/>
+        </w:rPr>
+        <w:t xml:space="preserve"> </w:t>
+      </w:r>
+    </w:p>
+    <w:p>
+      <w:pPr>
+        <w:rPr>
+          <w:b/>
           <w:color w:val="000000" w:themeColor="text1"/>
         </w:rPr>
       </w:pPr>
@@ -5664,49 +5655,1553 @@
         <w:rPr>
           <w:color w:val="000000" w:themeColor="text1"/>
         </w:rPr>
+      </w:pPr>
+      <w:r>
+        <w:rPr>
+          <w:color w:val="000000" w:themeColor="text1"/>
+        </w:rPr>
+        <w:t xml:space="preserve">An id is </w:t>
+      </w:r>
+      <w:proofErr w:type="gramStart"/>
+      <w:r>
+        <w:rPr>
+          <w:color w:val="000000" w:themeColor="text1"/>
+        </w:rPr>
+        <w:t>a  unique</w:t>
+      </w:r>
+      <w:proofErr w:type="gramEnd"/>
+      <w:r>
+        <w:rPr>
+          <w:color w:val="000000" w:themeColor="text1"/>
+        </w:rPr>
+        <w:t xml:space="preserve"> identifier </w:t>
+      </w:r>
+      <w:proofErr w:type="spellStart"/>
+      <w:r>
+        <w:rPr>
+          <w:color w:val="000000" w:themeColor="text1"/>
+        </w:rPr>
+        <w:t>assingned</w:t>
+      </w:r>
+      <w:proofErr w:type="spellEnd"/>
+      <w:r>
+        <w:rPr>
+          <w:color w:val="000000" w:themeColor="text1"/>
+        </w:rPr>
+        <w:t xml:space="preserve"> t only one   html element within the page. It is often used for the unique styling and java </w:t>
+      </w:r>
+      <w:proofErr w:type="spellStart"/>
+      <w:r>
+        <w:rPr>
+          <w:color w:val="000000" w:themeColor="text1"/>
+        </w:rPr>
+        <w:t>sript</w:t>
+      </w:r>
+      <w:proofErr w:type="spellEnd"/>
+      <w:r>
+        <w:rPr>
+          <w:color w:val="000000" w:themeColor="text1"/>
+        </w:rPr>
+        <w:t xml:space="preserve"> manipulations</w:t>
+      </w:r>
+    </w:p>
+    <w:p>
+      <w:pPr>
+        <w:rPr>
+          <w:color w:val="000000" w:themeColor="text1"/>
+        </w:rPr>
+      </w:pPr>
+    </w:p>
+    <w:p>
+      <w:pPr>
+        <w:rPr>
+          <w:b/>
+          <w:color w:val="1F497D" w:themeColor="text2"/>
+        </w:rPr>
+      </w:pPr>
+      <w:r>
+        <w:rPr>
+          <w:color w:val="000000" w:themeColor="text1"/>
+        </w:rPr>
+        <w:t xml:space="preserve">                       </w:t>
+      </w:r>
+    </w:p>
+    <w:p>
+      <w:pPr>
+        <w:rPr>
+          <w:b/>
+          <w:noProof/>
+          <w:color w:val="000000" w:themeColor="text1"/>
+        </w:rPr>
+      </w:pPr>
+      <w:r>
+        <w:rPr>
+          <w:b/>
+          <w:noProof/>
+          <w:color w:val="000000" w:themeColor="text1"/>
+        </w:rPr>
+        <w:br w:type="page"/>
+      </w:r>
+    </w:p>
+    <w:p>
+      <w:pPr>
+        <w:rPr>
+          <w:b/>
+          <w:color w:val="000000" w:themeColor="text1"/>
+        </w:rPr>
         <w:sectPr>
           <w:pgSz w:w="11909" w:h="16834"/>
           <w:pgMar w:top="1440" w:right="1440" w:bottom="1440" w:left="1700" w:header="720" w:footer="720" w:gutter="0"/>
           <w:cols w:space="720"/>
         </w:sectPr>
       </w:pPr>
-      <w:r>
-        <w:rPr>
-          <w:color w:val="000000" w:themeColor="text1"/>
-        </w:rPr>
-        <w:t>An id is a id</w:t>
-      </w:r>
+    </w:p>
+    <w:p>
+      <w:pPr>
+        <w:pStyle w:val="ListParagraph"/>
+        <w:numPr>
+          <w:ilvl w:val="0"/>
+          <w:numId w:val="13"/>
+        </w:numPr>
+        <w:rPr>
+          <w:b/>
+          <w:color w:val="4F81BD" w:themeColor="accent1"/>
+        </w:rPr>
+      </w:pPr>
+      <w:r>
+        <w:rPr>
+          <w:b/>
+          <w:color w:val="4F81BD" w:themeColor="accent1"/>
+        </w:rPr>
+        <w:lastRenderedPageBreak/>
+        <w:t xml:space="preserve">How to add audio video and media in the </w:t>
+      </w:r>
+      <w:proofErr w:type="gramStart"/>
+      <w:r>
+        <w:rPr>
+          <w:b/>
+          <w:color w:val="4F81BD" w:themeColor="accent1"/>
+        </w:rPr>
+        <w:t>html ?</w:t>
+      </w:r>
+      <w:proofErr w:type="gramEnd"/>
+    </w:p>
+    <w:p>
+      <w:pPr>
+        <w:shd w:val="clear" w:color="auto" w:fill="00002C"/>
+        <w:spacing w:line="285" w:lineRule="atLeast"/>
+        <w:rPr>
+          <w:rFonts w:ascii="Consolas" w:eastAsia="Times New Roman" w:hAnsi="Consolas" w:cs="Times New Roman"/>
+          <w:color w:val="FFFFFF"/>
+          <w:sz w:val="21"/>
+          <w:szCs w:val="21"/>
+        </w:rPr>
+      </w:pPr>
+      <w:r>
+        <w:rPr>
+          <w:rFonts w:ascii="Consolas" w:eastAsia="Times New Roman" w:hAnsi="Consolas" w:cs="Times New Roman"/>
+          <w:color w:val="FFFFFF"/>
+          <w:sz w:val="21"/>
+          <w:szCs w:val="21"/>
+        </w:rPr>
+        <w:t>&lt;</w:t>
+      </w:r>
+      <w:r>
+        <w:rPr>
+          <w:rFonts w:ascii="Consolas" w:eastAsia="Times New Roman" w:hAnsi="Consolas" w:cs="Times New Roman"/>
+          <w:color w:val="FF0077"/>
+          <w:sz w:val="21"/>
+          <w:szCs w:val="21"/>
+        </w:rPr>
+        <w:t>video</w:t>
+      </w:r>
+      <w:r>
+        <w:rPr>
+          <w:rFonts w:ascii="Consolas" w:eastAsia="Times New Roman" w:hAnsi="Consolas" w:cs="Times New Roman"/>
+          <w:color w:val="FFFFFF"/>
+          <w:sz w:val="21"/>
+          <w:szCs w:val="21"/>
+        </w:rPr>
+        <w:t xml:space="preserve"> </w:t>
+      </w:r>
+      <w:proofErr w:type="spellStart"/>
+      <w:r>
+        <w:rPr>
+          <w:rFonts w:ascii="Consolas" w:eastAsia="Times New Roman" w:hAnsi="Consolas" w:cs="Times New Roman"/>
+          <w:color w:val="00FFF2"/>
+          <w:sz w:val="21"/>
+          <w:szCs w:val="21"/>
+        </w:rPr>
+        <w:t>src</w:t>
+      </w:r>
+      <w:proofErr w:type="spellEnd"/>
+      <w:r>
+        <w:rPr>
+          <w:rFonts w:ascii="Consolas" w:eastAsia="Times New Roman" w:hAnsi="Consolas" w:cs="Times New Roman"/>
+          <w:color w:val="FFFFFF"/>
+          <w:sz w:val="21"/>
+          <w:szCs w:val="21"/>
+        </w:rPr>
+        <w:t>="</w:t>
+      </w:r>
+      <w:r>
+        <w:rPr>
+          <w:rFonts w:ascii="Consolas" w:eastAsia="Times New Roman" w:hAnsi="Consolas" w:cs="Times New Roman"/>
+          <w:color w:val="EEFF00"/>
+          <w:sz w:val="21"/>
+          <w:szCs w:val="21"/>
+        </w:rPr>
+        <w:t>video.mp4</w:t>
+      </w:r>
+      <w:r>
+        <w:rPr>
+          <w:rFonts w:ascii="Consolas" w:eastAsia="Times New Roman" w:hAnsi="Consolas" w:cs="Times New Roman"/>
+          <w:color w:val="FFFFFF"/>
+          <w:sz w:val="21"/>
+          <w:szCs w:val="21"/>
+        </w:rPr>
+        <w:t xml:space="preserve">" </w:t>
+      </w:r>
+      <w:r>
+        <w:rPr>
+          <w:rFonts w:ascii="Consolas" w:eastAsia="Times New Roman" w:hAnsi="Consolas" w:cs="Times New Roman"/>
+          <w:color w:val="00FFF2"/>
+          <w:sz w:val="21"/>
+          <w:szCs w:val="21"/>
+        </w:rPr>
+        <w:t>width</w:t>
+      </w:r>
+      <w:r>
+        <w:rPr>
+          <w:rFonts w:ascii="Consolas" w:eastAsia="Times New Roman" w:hAnsi="Consolas" w:cs="Times New Roman"/>
+          <w:color w:val="FFFFFF"/>
+          <w:sz w:val="21"/>
+          <w:szCs w:val="21"/>
+        </w:rPr>
+        <w:t xml:space="preserve"> = "</w:t>
+      </w:r>
+      <w:r>
+        <w:rPr>
+          <w:rFonts w:ascii="Consolas" w:eastAsia="Times New Roman" w:hAnsi="Consolas" w:cs="Times New Roman"/>
+          <w:color w:val="EEFF00"/>
+          <w:sz w:val="21"/>
+          <w:szCs w:val="21"/>
+        </w:rPr>
+        <w:t>350</w:t>
+      </w:r>
+      <w:r>
+        <w:rPr>
+          <w:rFonts w:ascii="Consolas" w:eastAsia="Times New Roman" w:hAnsi="Consolas" w:cs="Times New Roman"/>
+          <w:color w:val="FFFFFF"/>
+          <w:sz w:val="21"/>
+          <w:szCs w:val="21"/>
+        </w:rPr>
+        <w:t xml:space="preserve">" </w:t>
+      </w:r>
+      <w:r>
+        <w:rPr>
+          <w:rFonts w:ascii="Consolas" w:eastAsia="Times New Roman" w:hAnsi="Consolas" w:cs="Times New Roman"/>
+          <w:color w:val="00FFF2"/>
+          <w:sz w:val="21"/>
+          <w:szCs w:val="21"/>
+        </w:rPr>
+        <w:t xml:space="preserve">length </w:t>
+      </w:r>
+      <w:proofErr w:type="gramStart"/>
+      <w:r>
+        <w:rPr>
+          <w:rFonts w:ascii="Consolas" w:eastAsia="Times New Roman" w:hAnsi="Consolas" w:cs="Times New Roman"/>
+          <w:color w:val="00FFF2"/>
+          <w:sz w:val="21"/>
+          <w:szCs w:val="21"/>
+        </w:rPr>
+        <w:t>=  “</w:t>
+      </w:r>
+      <w:proofErr w:type="gramEnd"/>
+      <w:r>
+        <w:rPr>
+          <w:rFonts w:ascii="Consolas" w:eastAsia="Times New Roman" w:hAnsi="Consolas" w:cs="Times New Roman"/>
+          <w:color w:val="00FFF2"/>
+          <w:sz w:val="21"/>
+          <w:szCs w:val="21"/>
+        </w:rPr>
+        <w:t>22”</w:t>
+      </w:r>
+      <w:r>
+        <w:rPr>
+          <w:rFonts w:ascii="Consolas" w:eastAsia="Times New Roman" w:hAnsi="Consolas" w:cs="Times New Roman"/>
+          <w:color w:val="FFFFFF"/>
+          <w:sz w:val="21"/>
+          <w:szCs w:val="21"/>
+        </w:rPr>
+        <w:t xml:space="preserve"> </w:t>
+      </w:r>
+      <w:r>
+        <w:rPr>
+          <w:rFonts w:ascii="Consolas" w:eastAsia="Times New Roman" w:hAnsi="Consolas" w:cs="Times New Roman"/>
+          <w:color w:val="FF5370"/>
+          <w:sz w:val="21"/>
+          <w:szCs w:val="21"/>
+        </w:rPr>
+        <w:t>&lt;/video</w:t>
+      </w:r>
+      <w:r>
+        <w:rPr>
+          <w:rFonts w:ascii="Consolas" w:eastAsia="Times New Roman" w:hAnsi="Consolas" w:cs="Times New Roman"/>
+          <w:color w:val="FFFFFF"/>
+          <w:sz w:val="21"/>
+          <w:szCs w:val="21"/>
+        </w:rPr>
+        <w:t>&gt;</w:t>
+      </w:r>
+    </w:p>
+    <w:p>
+      <w:pPr>
+        <w:rPr>
+          <w:b/>
+          <w:color w:val="4F81BD" w:themeColor="accent1"/>
+        </w:rPr>
+      </w:pPr>
+      <w:proofErr w:type="gramStart"/>
+      <w:r>
+        <w:rPr>
+          <w:b/>
+          <w:color w:val="4F81BD" w:themeColor="accent1"/>
+        </w:rPr>
+        <w:t>video</w:t>
+      </w:r>
+      <w:proofErr w:type="gramEnd"/>
+    </w:p>
+    <w:p>
+      <w:r>
+        <w:rPr>
+          <w:b/>
+          <w:color w:val="4F81BD" w:themeColor="accent1"/>
+        </w:rPr>
+        <w:t xml:space="preserve">                                        </w:t>
+      </w:r>
+      <w:r>
+        <w:t>A</w:t>
+      </w:r>
+      <w:r>
+        <w:t xml:space="preserve">s you see that we use the this type of the attribute to play the videos in the </w:t>
+      </w:r>
+      <w:proofErr w:type="gramStart"/>
+      <w:r>
+        <w:t>html .</w:t>
+      </w:r>
+      <w:proofErr w:type="gramEnd"/>
+      <w:r>
+        <w:t xml:space="preserve"> </w:t>
+      </w:r>
+      <w:proofErr w:type="gramStart"/>
+      <w:r>
+        <w:t>here</w:t>
+      </w:r>
+      <w:proofErr w:type="gramEnd"/>
+      <w:r>
+        <w:t xml:space="preserve"> we use the length and width attribute to adjust the length and width of the  video in the browser . “video.mp4” is the name of the video that I saved by this </w:t>
+      </w:r>
+      <w:proofErr w:type="gramStart"/>
+      <w:r>
+        <w:t>name  so</w:t>
+      </w:r>
+      <w:proofErr w:type="gramEnd"/>
+      <w:r>
+        <w:t xml:space="preserve"> . </w:t>
+      </w:r>
+      <w:proofErr w:type="gramStart"/>
+      <w:r>
+        <w:t>we</w:t>
+      </w:r>
+      <w:proofErr w:type="gramEnd"/>
+      <w:r>
+        <w:t xml:space="preserve"> also use some more attributes in the video play. </w:t>
+      </w:r>
+    </w:p>
+    <w:p/>
+    <w:p>
+      <w:r>
+        <w:t xml:space="preserve">First one is the loop attribute that is used to play again the video when it reach at the end and then again start. </w:t>
+      </w:r>
+    </w:p>
+    <w:p>
+      <w:r>
+        <w:t>Second one is the muted attribute that is used to mute the video.</w:t>
+      </w:r>
+    </w:p>
+    <w:p>
+      <w:r>
+        <w:t xml:space="preserve">Third one is the posters attribute that is used as the thumbnail at the </w:t>
+      </w:r>
+      <w:proofErr w:type="gramStart"/>
+      <w:r>
+        <w:t>video .</w:t>
+      </w:r>
+      <w:proofErr w:type="gramEnd"/>
+      <w:r>
+        <w:t xml:space="preserve">  </w:t>
+      </w:r>
+    </w:p>
+    <w:p>
+      <w:pPr>
+        <w:rPr>
+          <w:b/>
+          <w:color w:val="4F81BD" w:themeColor="accent1"/>
+        </w:rPr>
+      </w:pPr>
+      <w:proofErr w:type="gramStart"/>
+      <w:r>
+        <w:rPr>
+          <w:b/>
+          <w:color w:val="4F81BD" w:themeColor="accent1"/>
+        </w:rPr>
+        <w:t>Audio :</w:t>
+      </w:r>
+      <w:proofErr w:type="gramEnd"/>
+    </w:p>
+    <w:p>
+      <w:r>
+        <w:t>And for the video we use same this type of the syntax and also same these attributes. But one of the attribute is changed. Which preload attribute.</w:t>
+      </w:r>
+    </w:p>
+    <w:p>
+      <w:r>
+        <w:rPr>
+          <w:b/>
+          <w:color w:val="4F81BD" w:themeColor="accent1"/>
+        </w:rPr>
+        <w:t>Preload attribute</w:t>
+      </w:r>
+      <w:r>
+        <w:t>:</w:t>
+      </w:r>
+    </w:p>
+    <w:p>
+      <w:pPr>
+        <w:rPr>
+          <w:rFonts w:eastAsia="Times New Roman"/>
+          <w:b/>
+          <w:bCs/>
+          <w:sz w:val="24"/>
+          <w:szCs w:val="24"/>
+        </w:rPr>
+      </w:pPr>
+      <w:r>
+        <w:t xml:space="preserve">      </w:t>
+      </w:r>
+      <w:r>
+        <w:rPr>
+          <w:rFonts w:eastAsia="Times New Roman"/>
+          <w:b/>
+          <w:bCs/>
+          <w:sz w:val="24"/>
+          <w:szCs w:val="24"/>
+        </w:rPr>
+        <w:t>Attribute Values:</w:t>
+      </w:r>
+    </w:p>
+    <w:tbl>
+      <w:tblPr>
+        <w:tblW w:w="0" w:type="auto"/>
+        <w:tblCellSpacing w:w="15" w:type="dxa"/>
+        <w:tblCellMar>
+          <w:top w:w="15" w:type="dxa"/>
+          <w:left w:w="15" w:type="dxa"/>
+          <w:bottom w:w="15" w:type="dxa"/>
+          <w:right w:w="15" w:type="dxa"/>
+        </w:tblCellMar>
+        <w:tblLook w:val="04A0" w:firstRow="1" w:lastRow="0" w:firstColumn="1" w:lastColumn="0" w:noHBand="0" w:noVBand="1"/>
+      </w:tblPr>
+      <w:tblGrid>
+        <w:gridCol w:w="1084"/>
+        <w:gridCol w:w="3447"/>
+        <w:gridCol w:w="4379"/>
+      </w:tblGrid>
+      <w:tr>
+        <w:trPr>
+          <w:tblCellSpacing w:w="15" w:type="dxa"/>
+        </w:trPr>
+        <w:tc>
+          <w:tcPr>
+            <w:tcW w:w="0" w:type="auto"/>
+            <w:tcBorders>
+              <w:bottom w:val="single" w:sz="6" w:space="0" w:color="444746"/>
+            </w:tcBorders>
+            <w:vAlign w:val="center"/>
+            <w:hideMark/>
+          </w:tcPr>
+          <w:p>
+            <w:pPr>
+              <w:spacing w:line="240" w:lineRule="auto"/>
+              <w:jc w:val="center"/>
+              <w:rPr>
+                <w:rFonts w:eastAsia="Times New Roman"/>
+                <w:b/>
+                <w:bCs/>
+                <w:sz w:val="21"/>
+                <w:szCs w:val="21"/>
+              </w:rPr>
+            </w:pPr>
+            <w:r>
+              <w:rPr>
+                <w:rFonts w:eastAsia="Times New Roman"/>
+                <w:b/>
+                <w:bCs/>
+                <w:sz w:val="21"/>
+                <w:szCs w:val="21"/>
+              </w:rPr>
+              <w:t>Value</w:t>
+            </w:r>
+          </w:p>
+        </w:tc>
+        <w:tc>
+          <w:tcPr>
+            <w:tcW w:w="0" w:type="auto"/>
+            <w:tcBorders>
+              <w:bottom w:val="single" w:sz="6" w:space="0" w:color="444746"/>
+            </w:tcBorders>
+            <w:vAlign w:val="center"/>
+            <w:hideMark/>
+          </w:tcPr>
+          <w:p>
+            <w:pPr>
+              <w:spacing w:line="240" w:lineRule="auto"/>
+              <w:jc w:val="center"/>
+              <w:rPr>
+                <w:rFonts w:eastAsia="Times New Roman"/>
+                <w:b/>
+                <w:bCs/>
+                <w:sz w:val="21"/>
+                <w:szCs w:val="21"/>
+              </w:rPr>
+            </w:pPr>
+            <w:r>
+              <w:rPr>
+                <w:rFonts w:eastAsia="Times New Roman"/>
+                <w:b/>
+                <w:bCs/>
+                <w:sz w:val="21"/>
+                <w:szCs w:val="21"/>
+              </w:rPr>
+              <w:t>Description</w:t>
+            </w:r>
+          </w:p>
+        </w:tc>
+        <w:tc>
+          <w:tcPr>
+            <w:tcW w:w="0" w:type="auto"/>
+            <w:tcBorders>
+              <w:bottom w:val="single" w:sz="6" w:space="0" w:color="444746"/>
+            </w:tcBorders>
+            <w:vAlign w:val="center"/>
+            <w:hideMark/>
+          </w:tcPr>
+          <w:p>
+            <w:pPr>
+              <w:spacing w:line="240" w:lineRule="auto"/>
+              <w:jc w:val="center"/>
+              <w:rPr>
+                <w:rFonts w:eastAsia="Times New Roman"/>
+                <w:b/>
+                <w:bCs/>
+                <w:sz w:val="21"/>
+                <w:szCs w:val="21"/>
+              </w:rPr>
+            </w:pPr>
+            <w:r>
+              <w:rPr>
+                <w:rFonts w:eastAsia="Times New Roman"/>
+                <w:b/>
+                <w:bCs/>
+                <w:sz w:val="21"/>
+                <w:szCs w:val="21"/>
+              </w:rPr>
+              <w:t>Best Use Case</w:t>
+            </w:r>
+          </w:p>
+        </w:tc>
+      </w:tr>
+      <w:tr>
+        <w:trPr>
+          <w:tblCellSpacing w:w="15" w:type="dxa"/>
+        </w:trPr>
+        <w:tc>
+          <w:tcPr>
+            <w:tcW w:w="0" w:type="auto"/>
+            <w:tcBorders>
+              <w:bottom w:val="single" w:sz="6" w:space="0" w:color="444746"/>
+            </w:tcBorders>
+            <w:vAlign w:val="center"/>
+            <w:hideMark/>
+          </w:tcPr>
+          <w:p>
+            <w:pPr>
+              <w:spacing w:line="240" w:lineRule="auto"/>
+              <w:rPr>
+                <w:rFonts w:eastAsia="Times New Roman"/>
+                <w:sz w:val="21"/>
+                <w:szCs w:val="21"/>
+              </w:rPr>
+            </w:pPr>
+            <w:r>
+              <w:rPr>
+                <w:rFonts w:ascii="Courier New" w:eastAsia="Times New Roman" w:hAnsi="Courier New" w:cs="Courier New"/>
+                <w:b/>
+                <w:bCs/>
+                <w:sz w:val="21"/>
+                <w:szCs w:val="21"/>
+              </w:rPr>
+              <w:t>none</w:t>
+            </w:r>
+          </w:p>
+        </w:tc>
+        <w:tc>
+          <w:tcPr>
+            <w:tcW w:w="0" w:type="auto"/>
+            <w:tcBorders>
+              <w:bottom w:val="single" w:sz="6" w:space="0" w:color="444746"/>
+            </w:tcBorders>
+            <w:vAlign w:val="center"/>
+            <w:hideMark/>
+          </w:tcPr>
+          <w:p>
+            <w:pPr>
+              <w:spacing w:line="240" w:lineRule="auto"/>
+              <w:rPr>
+                <w:rFonts w:eastAsia="Times New Roman"/>
+                <w:sz w:val="21"/>
+                <w:szCs w:val="21"/>
+              </w:rPr>
+            </w:pPr>
+            <w:r>
+              <w:rPr>
+                <w:rFonts w:eastAsia="Times New Roman"/>
+                <w:sz w:val="21"/>
+                <w:szCs w:val="21"/>
+              </w:rPr>
+              <w:t xml:space="preserve">The browser should </w:t>
+            </w:r>
+            <w:r>
+              <w:rPr>
+                <w:rFonts w:eastAsia="Times New Roman"/>
+                <w:b/>
+                <w:bCs/>
+                <w:sz w:val="21"/>
+                <w:szCs w:val="21"/>
+              </w:rPr>
+              <w:t>not</w:t>
+            </w:r>
+            <w:r>
+              <w:rPr>
+                <w:rFonts w:eastAsia="Times New Roman"/>
+                <w:sz w:val="21"/>
+                <w:szCs w:val="21"/>
+              </w:rPr>
+              <w:t xml:space="preserve"> load the media file when the page loads. It waits until the user clicks "Play".</w:t>
+            </w:r>
+          </w:p>
+        </w:tc>
+        <w:tc>
+          <w:tcPr>
+            <w:tcW w:w="0" w:type="auto"/>
+            <w:tcBorders>
+              <w:bottom w:val="single" w:sz="6" w:space="0" w:color="444746"/>
+            </w:tcBorders>
+            <w:vAlign w:val="center"/>
+            <w:hideMark/>
+          </w:tcPr>
+          <w:p>
+            <w:pPr>
+              <w:spacing w:line="240" w:lineRule="auto"/>
+              <w:rPr>
+                <w:rFonts w:eastAsia="Times New Roman"/>
+                <w:sz w:val="21"/>
+                <w:szCs w:val="21"/>
+              </w:rPr>
+            </w:pPr>
+            <w:r>
+              <w:rPr>
+                <w:rFonts w:eastAsia="Times New Roman"/>
+                <w:sz w:val="21"/>
+                <w:szCs w:val="21"/>
+              </w:rPr>
+              <w:t>Reduces server bandwidth and maximizes initial page speed. Highly recommended for non-essential videos.</w:t>
+            </w:r>
+          </w:p>
+        </w:tc>
+      </w:tr>
+      <w:tr>
+        <w:trPr>
+          <w:tblCellSpacing w:w="15" w:type="dxa"/>
+        </w:trPr>
+        <w:tc>
+          <w:tcPr>
+            <w:tcW w:w="0" w:type="auto"/>
+            <w:tcBorders>
+              <w:bottom w:val="single" w:sz="6" w:space="0" w:color="444746"/>
+            </w:tcBorders>
+            <w:vAlign w:val="center"/>
+            <w:hideMark/>
+          </w:tcPr>
+          <w:p>
+            <w:pPr>
+              <w:spacing w:line="240" w:lineRule="auto"/>
+              <w:rPr>
+                <w:rFonts w:eastAsia="Times New Roman"/>
+                <w:sz w:val="21"/>
+                <w:szCs w:val="21"/>
+              </w:rPr>
+            </w:pPr>
+            <w:r>
+              <w:rPr>
+                <w:rFonts w:ascii="Courier New" w:eastAsia="Times New Roman" w:hAnsi="Courier New" w:cs="Courier New"/>
+                <w:b/>
+                <w:bCs/>
+                <w:sz w:val="21"/>
+                <w:szCs w:val="21"/>
+              </w:rPr>
+              <w:t>M</w:t>
+            </w:r>
+            <w:r>
+              <w:rPr>
+                <w:rFonts w:ascii="Courier New" w:eastAsia="Times New Roman" w:hAnsi="Courier New" w:cs="Courier New"/>
+                <w:b/>
+                <w:bCs/>
+                <w:sz w:val="21"/>
+                <w:szCs w:val="21"/>
+              </w:rPr>
+              <w:t>etadata</w:t>
+            </w:r>
+            <w:r>
+              <w:rPr>
+                <w:rFonts w:ascii="Courier New" w:eastAsia="Times New Roman" w:hAnsi="Courier New" w:cs="Courier New"/>
+                <w:b/>
+                <w:bCs/>
+                <w:sz w:val="21"/>
+                <w:szCs w:val="21"/>
+              </w:rPr>
+              <w:t xml:space="preserve"> </w:t>
+            </w:r>
+          </w:p>
+        </w:tc>
+        <w:tc>
+          <w:tcPr>
+            <w:tcW w:w="0" w:type="auto"/>
+            <w:tcBorders>
+              <w:bottom w:val="single" w:sz="6" w:space="0" w:color="444746"/>
+            </w:tcBorders>
+            <w:vAlign w:val="center"/>
+            <w:hideMark/>
+          </w:tcPr>
+          <w:p>
+            <w:pPr>
+              <w:spacing w:line="240" w:lineRule="auto"/>
+              <w:rPr>
+                <w:rFonts w:eastAsia="Times New Roman"/>
+                <w:sz w:val="21"/>
+                <w:szCs w:val="21"/>
+              </w:rPr>
+            </w:pPr>
+            <w:r>
+              <w:rPr>
+                <w:rFonts w:eastAsia="Times New Roman"/>
+                <w:sz w:val="21"/>
+                <w:szCs w:val="21"/>
+              </w:rPr>
+              <w:t xml:space="preserve">The browser only fetches </w:t>
+            </w:r>
+            <w:r>
+              <w:rPr>
+                <w:rFonts w:eastAsia="Times New Roman"/>
+                <w:b/>
+                <w:bCs/>
+                <w:sz w:val="21"/>
+                <w:szCs w:val="21"/>
+              </w:rPr>
+              <w:t>basic information</w:t>
+            </w:r>
+            <w:r>
+              <w:rPr>
+                <w:rFonts w:eastAsia="Times New Roman"/>
+                <w:sz w:val="21"/>
+                <w:szCs w:val="21"/>
+              </w:rPr>
+              <w:t xml:space="preserve"> (dimensions, duration, first frame, </w:t>
+            </w:r>
+            <w:proofErr w:type="spellStart"/>
+            <w:r>
+              <w:rPr>
+                <w:rFonts w:eastAsia="Times New Roman"/>
+                <w:sz w:val="21"/>
+                <w:szCs w:val="21"/>
+              </w:rPr>
+              <w:t>tracklist</w:t>
+            </w:r>
+            <w:proofErr w:type="spellEnd"/>
+            <w:r>
+              <w:rPr>
+                <w:rFonts w:eastAsia="Times New Roman"/>
+                <w:sz w:val="21"/>
+                <w:szCs w:val="21"/>
+              </w:rPr>
+              <w:t>).</w:t>
+            </w:r>
+          </w:p>
+        </w:tc>
+        <w:tc>
+          <w:tcPr>
+            <w:tcW w:w="0" w:type="auto"/>
+            <w:tcBorders>
+              <w:bottom w:val="single" w:sz="6" w:space="0" w:color="444746"/>
+            </w:tcBorders>
+            <w:vAlign w:val="center"/>
+            <w:hideMark/>
+          </w:tcPr>
+          <w:p>
+            <w:pPr>
+              <w:spacing w:line="240" w:lineRule="auto"/>
+              <w:rPr>
+                <w:rFonts w:eastAsia="Times New Roman"/>
+                <w:sz w:val="21"/>
+                <w:szCs w:val="21"/>
+              </w:rPr>
+            </w:pPr>
+            <w:r>
+              <w:rPr>
+                <w:rFonts w:eastAsia="Times New Roman"/>
+                <w:sz w:val="21"/>
+                <w:szCs w:val="21"/>
+              </w:rPr>
+              <w:t>A great middle ground. It lets the player display accurate dimensions and duration without downloading the whole media file upfront.</w:t>
+            </w:r>
+          </w:p>
+        </w:tc>
+      </w:tr>
+      <w:tr>
+        <w:trPr>
+          <w:tblCellSpacing w:w="15" w:type="dxa"/>
+        </w:trPr>
+        <w:tc>
+          <w:tcPr>
+            <w:tcW w:w="0" w:type="auto"/>
+            <w:tcBorders>
+              <w:bottom w:val="nil"/>
+            </w:tcBorders>
+            <w:vAlign w:val="center"/>
+            <w:hideMark/>
+          </w:tcPr>
+          <w:p>
+            <w:pPr>
+              <w:spacing w:line="240" w:lineRule="auto"/>
+              <w:rPr>
+                <w:rFonts w:eastAsia="Times New Roman"/>
+                <w:sz w:val="21"/>
+                <w:szCs w:val="21"/>
+              </w:rPr>
+            </w:pPr>
+            <w:r>
+              <w:rPr>
+                <w:rFonts w:ascii="Courier New" w:eastAsia="Times New Roman" w:hAnsi="Courier New" w:cs="Courier New"/>
+                <w:b/>
+                <w:bCs/>
+                <w:sz w:val="21"/>
+                <w:szCs w:val="21"/>
+              </w:rPr>
+              <w:t>auto</w:t>
+            </w:r>
+          </w:p>
+        </w:tc>
+        <w:tc>
+          <w:tcPr>
+            <w:tcW w:w="0" w:type="auto"/>
+            <w:tcBorders>
+              <w:bottom w:val="nil"/>
+            </w:tcBorders>
+            <w:vAlign w:val="center"/>
+            <w:hideMark/>
+          </w:tcPr>
+          <w:p>
+            <w:pPr>
+              <w:spacing w:line="240" w:lineRule="auto"/>
+              <w:rPr>
+                <w:rFonts w:eastAsia="Times New Roman"/>
+                <w:sz w:val="21"/>
+                <w:szCs w:val="21"/>
+              </w:rPr>
+            </w:pPr>
+            <w:r>
+              <w:rPr>
+                <w:rFonts w:eastAsia="Times New Roman"/>
+                <w:sz w:val="21"/>
+                <w:szCs w:val="21"/>
+              </w:rPr>
+              <w:t xml:space="preserve">The browser should start downloading the </w:t>
+            </w:r>
+            <w:r>
+              <w:rPr>
+                <w:rFonts w:eastAsia="Times New Roman"/>
+                <w:b/>
+                <w:bCs/>
+                <w:sz w:val="21"/>
+                <w:szCs w:val="21"/>
+              </w:rPr>
+              <w:t>entire media file</w:t>
+            </w:r>
+            <w:r>
+              <w:rPr>
+                <w:rFonts w:eastAsia="Times New Roman"/>
+                <w:sz w:val="21"/>
+                <w:szCs w:val="21"/>
+              </w:rPr>
+              <w:t xml:space="preserve"> as soon as the page loads.</w:t>
+            </w:r>
+          </w:p>
+        </w:tc>
+        <w:tc>
+          <w:tcPr>
+            <w:tcW w:w="0" w:type="auto"/>
+            <w:tcBorders>
+              <w:bottom w:val="nil"/>
+            </w:tcBorders>
+            <w:vAlign w:val="center"/>
+            <w:hideMark/>
+          </w:tcPr>
+          <w:p>
+            <w:pPr>
+              <w:spacing w:line="240" w:lineRule="auto"/>
+              <w:rPr>
+                <w:rFonts w:eastAsia="Times New Roman"/>
+                <w:sz w:val="21"/>
+                <w:szCs w:val="21"/>
+              </w:rPr>
+            </w:pPr>
+            <w:r>
+              <w:rPr>
+                <w:rFonts w:eastAsia="Times New Roman"/>
+                <w:sz w:val="21"/>
+                <w:szCs w:val="21"/>
+              </w:rPr>
+              <w:t>Only use this if immediate playback is critical to your user experience.</w:t>
+            </w:r>
+          </w:p>
+        </w:tc>
+      </w:tr>
+    </w:tbl>
+    <w:p>
+      <w:pPr>
+        <w:rPr>
+          <w:b/>
+          <w:color w:val="4F81BD" w:themeColor="accent1"/>
+        </w:rPr>
+      </w:pPr>
+      <w:r>
+        <w:rPr>
+          <w:b/>
+          <w:color w:val="4F81BD" w:themeColor="accent1"/>
+        </w:rPr>
+        <w:t>SVG in the Html:</w:t>
+      </w:r>
+    </w:p>
+    <w:p>
+      <w:pPr>
+        <w:spacing w:line="240" w:lineRule="auto"/>
+        <w:rPr>
+          <w:rFonts w:eastAsia="Times New Roman"/>
+          <w:sz w:val="24"/>
+          <w:szCs w:val="24"/>
+        </w:rPr>
+      </w:pPr>
+      <w:r>
+        <w:rPr>
+          <w:rFonts w:eastAsia="Times New Roman"/>
+          <w:sz w:val="24"/>
+          <w:szCs w:val="24"/>
+        </w:rPr>
+        <w:t xml:space="preserve">The </w:t>
+      </w:r>
+      <w:r>
+        <w:rPr>
+          <w:rFonts w:ascii="Courier New" w:eastAsia="Times New Roman" w:hAnsi="Courier New" w:cs="Courier New"/>
+          <w:b/>
+          <w:bCs/>
+          <w:sz w:val="21"/>
+          <w:szCs w:val="21"/>
+        </w:rPr>
+        <w:t>&lt;</w:t>
+      </w:r>
+      <w:proofErr w:type="spellStart"/>
+      <w:r>
+        <w:rPr>
+          <w:rFonts w:ascii="Courier New" w:eastAsia="Times New Roman" w:hAnsi="Courier New" w:cs="Courier New"/>
+          <w:b/>
+          <w:bCs/>
+          <w:sz w:val="21"/>
+          <w:szCs w:val="21"/>
+        </w:rPr>
+        <w:t>svg</w:t>
+      </w:r>
+      <w:proofErr w:type="spellEnd"/>
+      <w:r>
+        <w:rPr>
+          <w:rFonts w:ascii="Courier New" w:eastAsia="Times New Roman" w:hAnsi="Courier New" w:cs="Courier New"/>
+          <w:b/>
+          <w:bCs/>
+          <w:sz w:val="21"/>
+          <w:szCs w:val="21"/>
+        </w:rPr>
+        <w:t>&gt;</w:t>
+      </w:r>
+      <w:r>
+        <w:rPr>
+          <w:rFonts w:eastAsia="Times New Roman"/>
+          <w:b/>
+          <w:bCs/>
+          <w:sz w:val="24"/>
+          <w:szCs w:val="24"/>
+        </w:rPr>
+        <w:t xml:space="preserve"> tag</w:t>
+      </w:r>
+      <w:r>
+        <w:rPr>
+          <w:rFonts w:eastAsia="Times New Roman"/>
+          <w:sz w:val="24"/>
+          <w:szCs w:val="24"/>
+        </w:rPr>
+        <w:t xml:space="preserve"> in HTML stands for Scalable Vector Graphics. It acts as a dedicated container used to draw two-dimensional, vector-based graphics directly inside a webpage. [</w:t>
+      </w:r>
+      <w:hyperlink r:id="rId9" w:history="1">
+        <w:r>
+          <w:rPr>
+            <w:rFonts w:eastAsia="Times New Roman"/>
+            <w:color w:val="0000FF"/>
+            <w:sz w:val="24"/>
+            <w:szCs w:val="24"/>
+            <w:u w:val="single"/>
+          </w:rPr>
+          <w:t>1</w:t>
+        </w:r>
+      </w:hyperlink>
+      <w:r>
+        <w:rPr>
+          <w:rFonts w:eastAsia="Times New Roman"/>
+          <w:sz w:val="24"/>
+          <w:szCs w:val="24"/>
+        </w:rPr>
+        <w:t xml:space="preserve">, </w:t>
+      </w:r>
+      <w:hyperlink r:id="rId10" w:history="1">
+        <w:r>
+          <w:rPr>
+            <w:rFonts w:eastAsia="Times New Roman"/>
+            <w:color w:val="0000FF"/>
+            <w:sz w:val="24"/>
+            <w:szCs w:val="24"/>
+            <w:u w:val="single"/>
+          </w:rPr>
+          <w:t>2</w:t>
+        </w:r>
+      </w:hyperlink>
+      <w:r>
+        <w:rPr>
+          <w:rFonts w:eastAsia="Times New Roman"/>
+          <w:sz w:val="24"/>
+          <w:szCs w:val="24"/>
+        </w:rPr>
+        <w:t xml:space="preserve">, </w:t>
+      </w:r>
+      <w:hyperlink r:id="rId11" w:history="1">
+        <w:r>
+          <w:rPr>
+            <w:rFonts w:eastAsia="Times New Roman"/>
+            <w:color w:val="0000FF"/>
+            <w:sz w:val="24"/>
+            <w:szCs w:val="24"/>
+            <w:u w:val="single"/>
+          </w:rPr>
+          <w:t>3</w:t>
+        </w:r>
+      </w:hyperlink>
+      <w:r>
+        <w:rPr>
+          <w:rFonts w:eastAsia="Times New Roman"/>
+          <w:sz w:val="24"/>
+          <w:szCs w:val="24"/>
+        </w:rPr>
+        <w:t xml:space="preserve">, </w:t>
+      </w:r>
+      <w:hyperlink r:id="rId12" w:history="1">
+        <w:r>
+          <w:rPr>
+            <w:rFonts w:eastAsia="Times New Roman"/>
+            <w:color w:val="0000FF"/>
+            <w:sz w:val="24"/>
+            <w:szCs w:val="24"/>
+            <w:u w:val="single"/>
+          </w:rPr>
+          <w:t>4</w:t>
+        </w:r>
+      </w:hyperlink>
+      <w:r>
+        <w:rPr>
+          <w:rFonts w:eastAsia="Times New Roman"/>
+          <w:sz w:val="24"/>
+          <w:szCs w:val="24"/>
+        </w:rPr>
+        <w:t>]</w:t>
+      </w:r>
+    </w:p>
+    <w:p>
+      <w:pPr>
+        <w:spacing w:line="240" w:lineRule="auto"/>
+        <w:rPr>
+          <w:rFonts w:eastAsia="Times New Roman"/>
+          <w:sz w:val="24"/>
+          <w:szCs w:val="24"/>
+        </w:rPr>
+      </w:pPr>
+      <w:r>
+        <w:rPr>
+          <w:rFonts w:eastAsia="Times New Roman"/>
+          <w:sz w:val="24"/>
+          <w:szCs w:val="24"/>
+        </w:rPr>
+        <w:t>Unlike traditional image formats like JPEG or PNG—which are made of fixed grids of pixels and get blurry or pixelated when zoomed in—</w:t>
+      </w:r>
+      <w:r>
+        <w:rPr>
+          <w:rFonts w:eastAsia="Times New Roman"/>
+          <w:b/>
+          <w:bCs/>
+          <w:sz w:val="24"/>
+          <w:szCs w:val="24"/>
+        </w:rPr>
+        <w:t>SVGs are built using mathematical equations and coordinates</w:t>
+      </w:r>
+      <w:r>
+        <w:rPr>
+          <w:rFonts w:eastAsia="Times New Roman"/>
+          <w:sz w:val="24"/>
+          <w:szCs w:val="24"/>
+        </w:rPr>
+        <w:t xml:space="preserve">. This means they stay </w:t>
+      </w:r>
+      <w:r>
+        <w:rPr>
+          <w:rFonts w:eastAsia="Times New Roman"/>
+          <w:b/>
+          <w:bCs/>
+          <w:sz w:val="24"/>
+          <w:szCs w:val="24"/>
+        </w:rPr>
+        <w:t>perfectly crisp and sharp at any screen resolution or size</w:t>
+      </w:r>
+      <w:r>
+        <w:rPr>
+          <w:rFonts w:eastAsia="Times New Roman"/>
+          <w:sz w:val="24"/>
+          <w:szCs w:val="24"/>
+        </w:rPr>
+        <w:t>. [</w:t>
+      </w:r>
+      <w:hyperlink r:id="rId13" w:history="1">
+        <w:r>
+          <w:rPr>
+            <w:rFonts w:eastAsia="Times New Roman"/>
+            <w:color w:val="0000FF"/>
+            <w:sz w:val="24"/>
+            <w:szCs w:val="24"/>
+            <w:u w:val="single"/>
+          </w:rPr>
+          <w:t>1</w:t>
+        </w:r>
+      </w:hyperlink>
+      <w:r>
+        <w:rPr>
+          <w:rFonts w:eastAsia="Times New Roman"/>
+          <w:sz w:val="24"/>
+          <w:szCs w:val="24"/>
+        </w:rPr>
+        <w:t xml:space="preserve">, </w:t>
+      </w:r>
+      <w:hyperlink r:id="rId14" w:history="1">
+        <w:r>
+          <w:rPr>
+            <w:rFonts w:eastAsia="Times New Roman"/>
+            <w:color w:val="0000FF"/>
+            <w:sz w:val="24"/>
+            <w:szCs w:val="24"/>
+            <w:u w:val="single"/>
+          </w:rPr>
+          <w:t>2</w:t>
+        </w:r>
+      </w:hyperlink>
+      <w:r>
+        <w:rPr>
+          <w:rFonts w:eastAsia="Times New Roman"/>
+          <w:sz w:val="24"/>
+          <w:szCs w:val="24"/>
+        </w:rPr>
+        <w:t xml:space="preserve">, </w:t>
+      </w:r>
+      <w:hyperlink r:id="rId15" w:history="1">
+        <w:r>
+          <w:rPr>
+            <w:rFonts w:eastAsia="Times New Roman"/>
+            <w:color w:val="0000FF"/>
+            <w:sz w:val="24"/>
+            <w:szCs w:val="24"/>
+            <w:u w:val="single"/>
+          </w:rPr>
+          <w:t>3</w:t>
+        </w:r>
+      </w:hyperlink>
+      <w:r>
+        <w:rPr>
+          <w:rFonts w:eastAsia="Times New Roman"/>
+          <w:sz w:val="24"/>
+          <w:szCs w:val="24"/>
+        </w:rPr>
+        <w:t xml:space="preserve">, </w:t>
+      </w:r>
+      <w:hyperlink r:id="rId16" w:history="1">
+        <w:r>
+          <w:rPr>
+            <w:rFonts w:eastAsia="Times New Roman"/>
+            <w:color w:val="0000FF"/>
+            <w:sz w:val="24"/>
+            <w:szCs w:val="24"/>
+            <w:u w:val="single"/>
+          </w:rPr>
+          <w:t>4</w:t>
+        </w:r>
+      </w:hyperlink>
+      <w:r>
+        <w:rPr>
+          <w:rFonts w:eastAsia="Times New Roman"/>
+          <w:sz w:val="24"/>
+          <w:szCs w:val="24"/>
+        </w:rPr>
+        <w:t xml:space="preserve">, </w:t>
+      </w:r>
+      <w:hyperlink r:id="rId17" w:history="1">
+        <w:r>
+          <w:rPr>
+            <w:rFonts w:eastAsia="Times New Roman"/>
+            <w:color w:val="0000FF"/>
+            <w:sz w:val="24"/>
+            <w:szCs w:val="24"/>
+            <w:u w:val="single"/>
+          </w:rPr>
+          <w:t>5</w:t>
+        </w:r>
+      </w:hyperlink>
+      <w:r>
+        <w:rPr>
+          <w:rFonts w:eastAsia="Times New Roman"/>
+          <w:sz w:val="24"/>
+          <w:szCs w:val="24"/>
+        </w:rPr>
+        <w:t xml:space="preserve">, </w:t>
+      </w:r>
+      <w:hyperlink r:id="rId18" w:history="1">
+        <w:r>
+          <w:rPr>
+            <w:rFonts w:eastAsia="Times New Roman"/>
+            <w:color w:val="0000FF"/>
+            <w:sz w:val="24"/>
+            <w:szCs w:val="24"/>
+            <w:u w:val="single"/>
+          </w:rPr>
+          <w:t>6</w:t>
+        </w:r>
+      </w:hyperlink>
+      <w:r>
+        <w:rPr>
+          <w:rFonts w:eastAsia="Times New Roman"/>
+          <w:sz w:val="24"/>
+          <w:szCs w:val="24"/>
+        </w:rPr>
+        <w:t>]</w:t>
+      </w:r>
+    </w:p>
+    <w:p>
+      <w:pPr>
+        <w:spacing w:line="240" w:lineRule="auto"/>
+        <w:rPr>
+          <w:rFonts w:eastAsia="Times New Roman"/>
+          <w:sz w:val="24"/>
+          <w:szCs w:val="24"/>
+        </w:rPr>
+      </w:pPr>
+    </w:p>
+    <w:p>
+      <w:pPr>
+        <w:rPr>
+          <w:b/>
+          <w:color w:val="4F81BD" w:themeColor="accent1"/>
+        </w:rPr>
+      </w:pPr>
+      <w:r>
+        <w:rPr>
+          <w:b/>
+          <w:color w:val="4F81BD" w:themeColor="accent1"/>
+        </w:rPr>
+        <w:t xml:space="preserve">I </w:t>
+      </w:r>
+      <w:proofErr w:type="spellStart"/>
+      <w:r>
+        <w:rPr>
+          <w:b/>
+          <w:color w:val="4F81BD" w:themeColor="accent1"/>
+        </w:rPr>
+        <w:t>fram</w:t>
+      </w:r>
+      <w:proofErr w:type="spellEnd"/>
+      <w:r>
+        <w:rPr>
+          <w:b/>
+          <w:color w:val="4F81BD" w:themeColor="accent1"/>
+        </w:rPr>
+        <w:t>:</w:t>
+      </w:r>
+    </w:p>
+    <w:p>
+      <w:pPr>
+        <w:rPr>
+          <w:b/>
+          <w:color w:val="4F81BD" w:themeColor="accent1"/>
+        </w:rPr>
+      </w:pPr>
+      <w:r>
+        <w:rPr>
+          <w:b/>
+          <w:color w:val="4F81BD" w:themeColor="accent1"/>
+        </w:rPr>
+        <w:t xml:space="preserve">         </w:t>
+      </w:r>
+    </w:p>
+    <w:p>
+      <w:r>
+        <w:t xml:space="preserve">     This is </w:t>
+      </w:r>
+      <w:r>
+        <w:t xml:space="preserve">the process by which you can imbed </w:t>
+      </w:r>
+      <w:proofErr w:type="gramStart"/>
+      <w:r>
+        <w:t>the another</w:t>
+      </w:r>
+      <w:proofErr w:type="gramEnd"/>
+      <w:r>
+        <w:t xml:space="preserve"> website into your website.</w:t>
+      </w:r>
+    </w:p>
+    <w:p>
+      <w:pPr>
+        <w:shd w:val="clear" w:color="auto" w:fill="00002C"/>
+        <w:spacing w:line="285" w:lineRule="atLeast"/>
+        <w:rPr>
+          <w:rFonts w:ascii="Consolas" w:eastAsia="Times New Roman" w:hAnsi="Consolas" w:cs="Times New Roman"/>
+          <w:color w:val="FFFFFF"/>
+          <w:sz w:val="21"/>
+          <w:szCs w:val="21"/>
+        </w:rPr>
+      </w:pPr>
+      <w:r>
+        <w:rPr>
+          <w:rFonts w:ascii="Consolas" w:eastAsia="Times New Roman" w:hAnsi="Consolas" w:cs="Times New Roman"/>
+          <w:color w:val="FFFFFF"/>
+          <w:sz w:val="21"/>
+          <w:szCs w:val="21"/>
+        </w:rPr>
+        <w:t>&lt;</w:t>
+      </w:r>
+      <w:proofErr w:type="spellStart"/>
+      <w:r>
+        <w:rPr>
+          <w:rFonts w:ascii="Consolas" w:eastAsia="Times New Roman" w:hAnsi="Consolas" w:cs="Times New Roman"/>
+          <w:color w:val="FF0077"/>
+          <w:sz w:val="21"/>
+          <w:szCs w:val="21"/>
+        </w:rPr>
+        <w:t>iframe</w:t>
+      </w:r>
+      <w:proofErr w:type="spellEnd"/>
+      <w:r>
+        <w:rPr>
+          <w:rFonts w:ascii="Consolas" w:eastAsia="Times New Roman" w:hAnsi="Consolas" w:cs="Times New Roman"/>
+          <w:color w:val="FFFFFF"/>
+          <w:sz w:val="21"/>
+          <w:szCs w:val="21"/>
+        </w:rPr>
+        <w:t xml:space="preserve"> </w:t>
+      </w:r>
+      <w:proofErr w:type="spellStart"/>
+      <w:r>
+        <w:rPr>
+          <w:rFonts w:ascii="Consolas" w:eastAsia="Times New Roman" w:hAnsi="Consolas" w:cs="Times New Roman"/>
+          <w:color w:val="00FFF2"/>
+          <w:sz w:val="21"/>
+          <w:szCs w:val="21"/>
+        </w:rPr>
+        <w:t>src</w:t>
+      </w:r>
+      <w:proofErr w:type="spellEnd"/>
+      <w:r>
+        <w:rPr>
+          <w:rFonts w:ascii="Consolas" w:eastAsia="Times New Roman" w:hAnsi="Consolas" w:cs="Times New Roman"/>
+          <w:color w:val="FFFFFF"/>
+          <w:sz w:val="21"/>
+          <w:szCs w:val="21"/>
+        </w:rPr>
+        <w:t>="</w:t>
+      </w:r>
+      <w:r>
+        <w:rPr>
+          <w:rFonts w:ascii="Consolas" w:eastAsia="Times New Roman" w:hAnsi="Consolas" w:cs="Times New Roman"/>
+          <w:color w:val="EEFF00"/>
+          <w:sz w:val="21"/>
+          <w:szCs w:val="21"/>
+        </w:rPr>
+        <w:t>https://www.w3schools.com/TAGs/att_preload.asp</w:t>
+      </w:r>
+      <w:r>
+        <w:rPr>
+          <w:rFonts w:ascii="Consolas" w:eastAsia="Times New Roman" w:hAnsi="Consolas" w:cs="Times New Roman"/>
+          <w:color w:val="FFFFFF"/>
+          <w:sz w:val="21"/>
+          <w:szCs w:val="21"/>
+        </w:rPr>
+        <w:t xml:space="preserve">" </w:t>
+      </w:r>
+      <w:r>
+        <w:rPr>
+          <w:rFonts w:ascii="Consolas" w:eastAsia="Times New Roman" w:hAnsi="Consolas" w:cs="Times New Roman"/>
+          <w:color w:val="00FFF2"/>
+          <w:sz w:val="21"/>
+          <w:szCs w:val="21"/>
+        </w:rPr>
+        <w:t>height</w:t>
+      </w:r>
+      <w:r>
+        <w:rPr>
+          <w:rFonts w:ascii="Consolas" w:eastAsia="Times New Roman" w:hAnsi="Consolas" w:cs="Times New Roman"/>
+          <w:color w:val="FFFFFF"/>
+          <w:sz w:val="21"/>
+          <w:szCs w:val="21"/>
+        </w:rPr>
+        <w:t>="</w:t>
+      </w:r>
+      <w:r>
+        <w:rPr>
+          <w:rFonts w:ascii="Consolas" w:eastAsia="Times New Roman" w:hAnsi="Consolas" w:cs="Times New Roman"/>
+          <w:color w:val="EEFF00"/>
+          <w:sz w:val="21"/>
+          <w:szCs w:val="21"/>
+        </w:rPr>
+        <w:t>67</w:t>
+      </w:r>
+      <w:r>
+        <w:rPr>
+          <w:rFonts w:ascii="Consolas" w:eastAsia="Times New Roman" w:hAnsi="Consolas" w:cs="Times New Roman"/>
+          <w:color w:val="FFFFFF"/>
+          <w:sz w:val="21"/>
+          <w:szCs w:val="21"/>
+        </w:rPr>
+        <w:t xml:space="preserve">" </w:t>
+      </w:r>
+      <w:r>
+        <w:rPr>
+          <w:rFonts w:ascii="Consolas" w:eastAsia="Times New Roman" w:hAnsi="Consolas" w:cs="Times New Roman"/>
+          <w:color w:val="00FFF2"/>
+          <w:sz w:val="21"/>
+          <w:szCs w:val="21"/>
+        </w:rPr>
+        <w:t>width</w:t>
+      </w:r>
+      <w:r>
+        <w:rPr>
+          <w:rFonts w:ascii="Consolas" w:eastAsia="Times New Roman" w:hAnsi="Consolas" w:cs="Times New Roman"/>
+          <w:color w:val="FFFFFF"/>
+          <w:sz w:val="21"/>
+          <w:szCs w:val="21"/>
+        </w:rPr>
+        <w:t>="</w:t>
+      </w:r>
+      <w:r>
+        <w:rPr>
+          <w:rFonts w:ascii="Consolas" w:eastAsia="Times New Roman" w:hAnsi="Consolas" w:cs="Times New Roman"/>
+          <w:color w:val="EEFF00"/>
+          <w:sz w:val="21"/>
+          <w:szCs w:val="21"/>
+        </w:rPr>
+        <w:t>433</w:t>
+      </w:r>
+      <w:r>
+        <w:rPr>
+          <w:rFonts w:ascii="Consolas" w:eastAsia="Times New Roman" w:hAnsi="Consolas" w:cs="Times New Roman"/>
+          <w:color w:val="FFFFFF"/>
+          <w:sz w:val="21"/>
+          <w:szCs w:val="21"/>
+        </w:rPr>
+        <w:t>"&gt;&lt;/</w:t>
+      </w:r>
+      <w:proofErr w:type="spellStart"/>
+      <w:r>
+        <w:rPr>
+          <w:rFonts w:ascii="Consolas" w:eastAsia="Times New Roman" w:hAnsi="Consolas" w:cs="Times New Roman"/>
+          <w:color w:val="FF0077"/>
+          <w:sz w:val="21"/>
+          <w:szCs w:val="21"/>
+        </w:rPr>
+        <w:t>iframe</w:t>
+      </w:r>
+      <w:proofErr w:type="spellEnd"/>
+      <w:r>
+        <w:rPr>
+          <w:rFonts w:ascii="Consolas" w:eastAsia="Times New Roman" w:hAnsi="Consolas" w:cs="Times New Roman"/>
+          <w:color w:val="FFFFFF"/>
+          <w:sz w:val="21"/>
+          <w:szCs w:val="21"/>
+        </w:rPr>
+        <w:t>&gt;</w:t>
+      </w:r>
+    </w:p>
+    <w:p>
+      <w:r>
+        <w:t xml:space="preserve"> Just like that syntax we use </w:t>
+      </w:r>
+      <w:proofErr w:type="spellStart"/>
+      <w:r>
+        <w:t>ifram</w:t>
+      </w:r>
+      <w:proofErr w:type="spellEnd"/>
+      <w:r>
+        <w:t xml:space="preserve"> attribute and use </w:t>
+      </w:r>
+      <w:proofErr w:type="spellStart"/>
+      <w:r>
+        <w:t>src</w:t>
+      </w:r>
+      <w:proofErr w:type="spellEnd"/>
+      <w:r>
+        <w:t xml:space="preserve"> and the </w:t>
+      </w:r>
+      <w:proofErr w:type="spellStart"/>
+      <w:proofErr w:type="gramStart"/>
+      <w:r>
+        <w:t>url</w:t>
+      </w:r>
+      <w:proofErr w:type="spellEnd"/>
+      <w:proofErr w:type="gramEnd"/>
+      <w:r>
+        <w:t xml:space="preserve"> of the website that we want to imbed and then adjust the height and width in which that website view you wants to see. </w:t>
+      </w:r>
+    </w:p>
+    <w:p>
       <w:bookmarkStart w:id="5" w:name="_GoBack"/>
       <w:bookmarkEnd w:id="5"/>
-      <w:r>
-        <w:rPr>
-          <w:color w:val="000000" w:themeColor="text1"/>
-        </w:rPr>
-        <w:t xml:space="preserve">entifier </w:t>
-      </w:r>
-      <w:proofErr w:type="spellStart"/>
-      <w:r>
-        <w:rPr>
-          <w:color w:val="000000" w:themeColor="text1"/>
-        </w:rPr>
-        <w:t>assingned</w:t>
-      </w:r>
-      <w:proofErr w:type="spellEnd"/>
-      <w:r>
-        <w:rPr>
-          <w:color w:val="000000" w:themeColor="text1"/>
-        </w:rPr>
-        <w:t xml:space="preserve"> to only one HTML element  </w:t>
-      </w:r>
-    </w:p>
-    <w:p>
-      <w:pPr>
-        <w:keepLines/>
-        <w:spacing w:line="360" w:lineRule="auto"/>
-        <w:rPr>
-          <w:color w:val="434343"/>
-        </w:rPr>
-      </w:pPr>
     </w:p>
     <w:sectPr>
       <w:pgSz w:w="11909" w:h="16834"/>
@@ -6457,7 +7952,7 @@
   <w:abstractNum w:abstractNumId="6">
     <w:nsid w:val="3E447CA3"/>
     <w:multiLevelType w:val="hybridMultilevel"/>
-    <w:tmpl w:val="B628CB7A"/>
+    <w:tmpl w:val="EE7EF708"/>
     <w:lvl w:ilvl="0" w:tplc="0409000B">
       <w:start w:val="1"/>
       <w:numFmt w:val="bullet"/>
@@ -7795,6 +9290,7 @@
   </w:latentStyles>
   <w:style w:type="paragraph" w:default="1" w:styleId="Normal">
     <w:name w:val="Normal"/>
+    <w:rsid w:val="002037E5"/>
   </w:style>
   <w:style w:type="paragraph" w:styleId="Heading1">
     <w:name w:val="heading 1"/>
@@ -7978,6 +9474,54 @@
       <w:ind w:left="720"/>
       <w:contextualSpacing/>
     </w:pPr>
+  </w:style>
+  <w:style w:type="character" w:styleId="IntenseEmphasis">
+    <w:name w:val="Intense Emphasis"/>
+    <w:basedOn w:val="DefaultParagraphFont"/>
+    <w:uiPriority w:val="21"/>
+    <w:qFormat/>
+    <w:rsid w:val="00C30EF1"/>
+    <w:rPr>
+      <w:i/>
+      <w:iCs/>
+      <w:color w:val="4F81BD" w:themeColor="accent1"/>
+    </w:rPr>
+  </w:style>
+  <w:style w:type="character" w:styleId="Strong">
+    <w:name w:val="Strong"/>
+    <w:basedOn w:val="DefaultParagraphFont"/>
+    <w:uiPriority w:val="22"/>
+    <w:qFormat/>
+    <w:rsid w:val="009740BB"/>
+    <w:rPr>
+      <w:b/>
+      <w:bCs/>
+    </w:rPr>
+  </w:style>
+  <w:style w:type="character" w:styleId="HTMLCode">
+    <w:name w:val="HTML Code"/>
+    <w:basedOn w:val="DefaultParagraphFont"/>
+    <w:uiPriority w:val="99"/>
+    <w:semiHidden/>
+    <w:unhideWhenUsed/>
+    <w:rsid w:val="009740BB"/>
+    <w:rPr>
+      <w:rFonts w:ascii="Courier New" w:eastAsia="Times New Roman" w:hAnsi="Courier New" w:cs="Courier New"/>
+      <w:sz w:val="20"/>
+      <w:szCs w:val="20"/>
+    </w:rPr>
+  </w:style>
+  <w:style w:type="character" w:styleId="Hyperlink">
+    <w:name w:val="Hyperlink"/>
+    <w:basedOn w:val="DefaultParagraphFont"/>
+    <w:uiPriority w:val="99"/>
+    <w:semiHidden/>
+    <w:unhideWhenUsed/>
+    <w:rsid w:val="003C293C"/>
+    <w:rPr>
+      <w:color w:val="0000FF"/>
+      <w:u w:val="single"/>
+    </w:rPr>
   </w:style>
 </w:styles>
 </file>

</xml_diff>

<commit_message>
pushing the day 7 programs
</commit_message>
<xml_diff>
--- a/HTML/HTML Notes Scratch to pro..docx
+++ b/HTML/HTML Notes Scratch to pro..docx
@@ -7199,9 +7199,384 @@
         <w:t xml:space="preserve"> of the website that we want to imbed and then adjust the height and width in which that website view you wants to see. </w:t>
       </w:r>
     </w:p>
-    <w:p>
+    <w:p/>
+    <w:p/>
+    <w:p/>
+    <w:p/>
+    <w:p>
+      <w:pPr>
+        <w:rPr>
+          <w:b/>
+          <w:color w:val="4F81BD" w:themeColor="accent1"/>
+        </w:rPr>
+      </w:pPr>
+    </w:p>
+    <w:p>
+      <w:pPr>
+        <w:rPr>
+          <w:b/>
+          <w:color w:val="4F81BD" w:themeColor="accent1"/>
+        </w:rPr>
+      </w:pPr>
+      <w:r>
+        <w:rPr>
+          <w:b/>
+          <w:color w:val="4F81BD" w:themeColor="accent1"/>
+        </w:rPr>
+        <w:t>Day</w:t>
+      </w:r>
+      <w:proofErr w:type="gramStart"/>
+      <w:r>
+        <w:rPr>
+          <w:b/>
+          <w:color w:val="4F81BD" w:themeColor="accent1"/>
+        </w:rPr>
+        <w:t>:07</w:t>
+      </w:r>
+      <w:proofErr w:type="gramEnd"/>
+    </w:p>
+    <w:p>
+      <w:pPr>
+        <w:rPr>
+          <w:b/>
+          <w:color w:val="4F81BD" w:themeColor="accent1"/>
+        </w:rPr>
+      </w:pPr>
+      <w:r>
+        <w:rPr>
+          <w:b/>
+          <w:color w:val="4F81BD" w:themeColor="accent1"/>
+        </w:rPr>
+        <w:t>24 sep</w:t>
+      </w:r>
+      <w:proofErr w:type="gramStart"/>
+      <w:r>
+        <w:rPr>
+          <w:b/>
+          <w:color w:val="4F81BD" w:themeColor="accent1"/>
+        </w:rPr>
+        <w:t>,2026</w:t>
+      </w:r>
+      <w:proofErr w:type="gramEnd"/>
+    </w:p>
+    <w:p>
+      <w:pPr>
+        <w:rPr>
+          <w:b/>
+          <w:color w:val="4F81BD" w:themeColor="accent1"/>
+        </w:rPr>
+      </w:pPr>
+    </w:p>
+    <w:p>
+      <w:pPr>
+        <w:rPr>
+          <w:b/>
+          <w:color w:val="4F81BD" w:themeColor="accent1"/>
+        </w:rPr>
+      </w:pPr>
+    </w:p>
+    <w:p>
+      <w:pPr>
+        <w:rPr>
+          <w:b/>
+          <w:color w:val="000000" w:themeColor="text1"/>
+        </w:rPr>
+      </w:pPr>
+    </w:p>
+    <w:p>
+      <w:pPr>
+        <w:rPr>
+          <w:b/>
+          <w:color w:val="000000" w:themeColor="text1"/>
+        </w:rPr>
+      </w:pPr>
+      <w:r>
+        <w:rPr>
+          <w:b/>
+          <w:color w:val="000000" w:themeColor="text1"/>
+        </w:rPr>
+        <w:t>Sematic Tags in the html:</w:t>
+      </w:r>
+    </w:p>
+    <w:p>
+      <w:pPr>
+        <w:rPr>
+          <w:b/>
+          <w:color w:val="000000" w:themeColor="text1"/>
+        </w:rPr>
+      </w:pPr>
+      <w:r>
+        <w:rPr>
+          <w:b/>
+          <w:color w:val="000000" w:themeColor="text1"/>
+        </w:rPr>
+        <w:t xml:space="preserve">                                          </w:t>
+      </w:r>
+    </w:p>
+    <w:p>
+      <w:pPr>
+        <w:rPr>
+          <w:color w:val="000000" w:themeColor="text1"/>
+        </w:rPr>
+      </w:pPr>
+      <w:r>
+        <w:rPr>
+          <w:b/>
+          <w:color w:val="000000" w:themeColor="text1"/>
+        </w:rPr>
+        <w:t xml:space="preserve">                              </w:t>
+      </w:r>
+      <w:r>
+        <w:rPr>
+          <w:color w:val="000000" w:themeColor="text1"/>
+        </w:rPr>
+        <w:t xml:space="preserve">These are tags that are used to provide a meaning to structure of the </w:t>
+      </w:r>
+      <w:proofErr w:type="spellStart"/>
+      <w:r>
+        <w:rPr>
+          <w:color w:val="000000" w:themeColor="text1"/>
+        </w:rPr>
+        <w:t>webcontent</w:t>
+      </w:r>
+      <w:proofErr w:type="spellEnd"/>
+      <w:r>
+        <w:rPr>
+          <w:color w:val="000000" w:themeColor="text1"/>
+        </w:rPr>
+        <w:t>.</w:t>
+      </w:r>
+    </w:p>
+    <w:p>
+      <w:pPr>
+        <w:rPr>
+          <w:color w:val="000000" w:themeColor="text1"/>
+        </w:rPr>
+      </w:pPr>
+      <w:r>
+        <w:rPr>
+          <w:color w:val="000000" w:themeColor="text1"/>
+        </w:rPr>
+        <w:t>1 &lt;header&gt;</w:t>
+      </w:r>
+    </w:p>
+    <w:p>
+      <w:pPr>
+        <w:rPr>
+          <w:color w:val="000000" w:themeColor="text1"/>
+        </w:rPr>
+      </w:pPr>
+      <w:r>
+        <w:rPr>
+          <w:color w:val="000000" w:themeColor="text1"/>
+        </w:rPr>
+        <w:t>2 &lt;</w:t>
+      </w:r>
+      <w:proofErr w:type="spellStart"/>
+      <w:r>
+        <w:rPr>
+          <w:color w:val="000000" w:themeColor="text1"/>
+        </w:rPr>
+        <w:t>nav</w:t>
+      </w:r>
+      <w:proofErr w:type="spellEnd"/>
+      <w:r>
+        <w:rPr>
+          <w:color w:val="000000" w:themeColor="text1"/>
+        </w:rPr>
+        <w:t>&gt;</w:t>
+      </w:r>
+    </w:p>
+    <w:p>
+      <w:pPr>
+        <w:rPr>
+          <w:color w:val="000000" w:themeColor="text1"/>
+        </w:rPr>
+      </w:pPr>
+      <w:r>
+        <w:rPr>
+          <w:color w:val="000000" w:themeColor="text1"/>
+        </w:rPr>
+        <w:t>3 &lt;section&gt;</w:t>
+      </w:r>
+    </w:p>
+    <w:p>
+      <w:pPr>
+        <w:rPr>
+          <w:color w:val="000000" w:themeColor="text1"/>
+        </w:rPr>
+      </w:pPr>
+      <w:r>
+        <w:rPr>
+          <w:color w:val="000000" w:themeColor="text1"/>
+        </w:rPr>
+        <w:t>4 &lt;article&gt;</w:t>
+      </w:r>
+    </w:p>
+    <w:p>
+      <w:pPr>
+        <w:rPr>
+          <w:color w:val="000000" w:themeColor="text1"/>
+        </w:rPr>
+      </w:pPr>
+      <w:r>
+        <w:rPr>
+          <w:color w:val="000000" w:themeColor="text1"/>
+        </w:rPr>
+        <w:t xml:space="preserve">5 &lt;footer&gt; </w:t>
+      </w:r>
+    </w:p>
+    <w:p>
+      <w:pPr>
+        <w:rPr>
+          <w:color w:val="000000" w:themeColor="text1"/>
+        </w:rPr>
+      </w:pPr>
+      <w:r>
+        <w:rPr>
+          <w:color w:val="000000" w:themeColor="text1"/>
+        </w:rPr>
+        <w:t>6 &lt;figure&gt;</w:t>
+      </w:r>
+    </w:p>
+    <w:p>
+      <w:pPr>
+        <w:rPr>
+          <w:color w:val="000000" w:themeColor="text1"/>
+        </w:rPr>
+      </w:pPr>
+      <w:r>
+        <w:rPr>
+          <w:color w:val="000000" w:themeColor="text1"/>
+        </w:rPr>
+        <w:t>7 &lt;Main&gt;</w:t>
+      </w:r>
+    </w:p>
+    <w:p>
+      <w:pPr>
+        <w:rPr>
+          <w:color w:val="000000" w:themeColor="text1"/>
+        </w:rPr>
+      </w:pPr>
+      <w:r>
+        <w:rPr>
+          <w:color w:val="000000" w:themeColor="text1"/>
+        </w:rPr>
+        <w:t>8 &lt;Time&gt;</w:t>
+      </w:r>
+    </w:p>
+    <w:p>
+      <w:pPr>
+        <w:rPr>
+          <w:color w:val="000000" w:themeColor="text1"/>
+        </w:rPr>
+      </w:pPr>
+      <w:r>
+        <w:rPr>
+          <w:color w:val="000000" w:themeColor="text1"/>
+        </w:rPr>
+        <w:t xml:space="preserve"> These are the semantic tag that we used to structure </w:t>
+      </w:r>
+      <w:proofErr w:type="spellStart"/>
+      <w:r>
+        <w:rPr>
+          <w:color w:val="000000" w:themeColor="text1"/>
+        </w:rPr>
+        <w:t>webcontent</w:t>
+      </w:r>
+      <w:proofErr w:type="spellEnd"/>
+      <w:r>
+        <w:rPr>
+          <w:color w:val="000000" w:themeColor="text1"/>
+        </w:rPr>
+        <w:t xml:space="preserve"> means to structure each </w:t>
+      </w:r>
+      <w:proofErr w:type="gramStart"/>
+      <w:r>
+        <w:rPr>
+          <w:color w:val="000000" w:themeColor="text1"/>
+        </w:rPr>
+        <w:t>things .</w:t>
+      </w:r>
+      <w:proofErr w:type="gramEnd"/>
+      <w:r>
+        <w:rPr>
+          <w:color w:val="000000" w:themeColor="text1"/>
+        </w:rPr>
+        <w:t xml:space="preserve"> </w:t>
+      </w:r>
+    </w:p>
+    <w:p>
+      <w:pPr>
+        <w:rPr>
+          <w:color w:val="000000" w:themeColor="text1"/>
+        </w:rPr>
+      </w:pPr>
+      <w:proofErr w:type="spellStart"/>
+      <w:r>
+        <w:rPr>
+          <w:color w:val="000000" w:themeColor="text1"/>
+        </w:rPr>
+        <w:t>e.g</w:t>
+      </w:r>
+      <w:proofErr w:type="spellEnd"/>
+      <w:r>
+        <w:rPr>
+          <w:color w:val="000000" w:themeColor="text1"/>
+        </w:rPr>
+        <w:t xml:space="preserve"> in the laptop we makes the folder </w:t>
+      </w:r>
+      <w:proofErr w:type="spellStart"/>
+      <w:r>
+        <w:rPr>
+          <w:color w:val="000000" w:themeColor="text1"/>
+        </w:rPr>
+        <w:t>sperartely</w:t>
+      </w:r>
+      <w:proofErr w:type="spellEnd"/>
+      <w:r>
+        <w:rPr>
+          <w:color w:val="000000" w:themeColor="text1"/>
+        </w:rPr>
+        <w:t xml:space="preserve"> for the images ,videos , </w:t>
+      </w:r>
+      <w:proofErr w:type="spellStart"/>
+      <w:r>
+        <w:rPr>
+          <w:color w:val="000000" w:themeColor="text1"/>
+        </w:rPr>
+        <w:t>docs.etc</w:t>
+      </w:r>
+      <w:proofErr w:type="spellEnd"/>
+      <w:r>
+        <w:rPr>
+          <w:color w:val="000000" w:themeColor="text1"/>
+        </w:rPr>
+        <w:t xml:space="preserve"> so for each thing separate arrangements are done by us so,  as it is in the semantic tag we use these  tags for best structural </w:t>
+      </w:r>
+      <w:proofErr w:type="spellStart"/>
+      <w:r>
+        <w:rPr>
+          <w:color w:val="000000" w:themeColor="text1"/>
+        </w:rPr>
+        <w:t>webcontent</w:t>
+      </w:r>
+      <w:proofErr w:type="spellEnd"/>
+      <w:r>
+        <w:rPr>
+          <w:color w:val="000000" w:themeColor="text1"/>
+        </w:rPr>
+        <w:t>.</w:t>
+      </w:r>
       <w:bookmarkStart w:id="5" w:name="_GoBack"/>
       <w:bookmarkEnd w:id="5"/>
+    </w:p>
+    <w:p>
+      <w:pPr>
+        <w:rPr>
+          <w:color w:val="000000" w:themeColor="text1"/>
+        </w:rPr>
+      </w:pPr>
     </w:p>
     <w:sectPr>
       <w:pgSz w:w="11909" w:h="16834"/>

</xml_diff>

<commit_message>
adding the day 8 programs
</commit_message>
<xml_diff>
--- a/HTML/HTML Notes Scratch to pro..docx
+++ b/HTML/HTML Notes Scratch to pro..docx
@@ -7568,15 +7568,307 @@
         </w:rPr>
         <w:t>.</w:t>
       </w:r>
+    </w:p>
+    <w:p>
+      <w:pPr>
+        <w:rPr>
+          <w:color w:val="000000" w:themeColor="text1"/>
+        </w:rPr>
+      </w:pPr>
+    </w:p>
+    <w:p>
+      <w:pPr>
+        <w:rPr>
+          <w:color w:val="000000" w:themeColor="text1"/>
+        </w:rPr>
+      </w:pPr>
+    </w:p>
+    <w:p>
+      <w:pPr>
+        <w:rPr>
+          <w:color w:val="000000" w:themeColor="text1"/>
+        </w:rPr>
+      </w:pPr>
+    </w:p>
+    <w:p>
+      <w:pPr>
+        <w:rPr>
+          <w:b/>
+          <w:color w:val="4F81BD" w:themeColor="accent1"/>
+        </w:rPr>
+      </w:pPr>
+      <w:r>
+        <w:rPr>
+          <w:b/>
+          <w:color w:val="4F81BD" w:themeColor="accent1"/>
+        </w:rPr>
+        <w:t>Day</w:t>
+      </w:r>
+      <w:proofErr w:type="gramStart"/>
+      <w:r>
+        <w:rPr>
+          <w:b/>
+          <w:color w:val="4F81BD" w:themeColor="accent1"/>
+        </w:rPr>
+        <w:t>:08</w:t>
+      </w:r>
+      <w:proofErr w:type="gramEnd"/>
+    </w:p>
+    <w:p>
+      <w:pPr>
+        <w:rPr>
+          <w:b/>
+          <w:color w:val="4F81BD" w:themeColor="accent1"/>
+        </w:rPr>
+      </w:pPr>
+      <w:r>
+        <w:rPr>
+          <w:b/>
+          <w:color w:val="4F81BD" w:themeColor="accent1"/>
+        </w:rPr>
+        <w:t>25</w:t>
+      </w:r>
+      <w:r>
+        <w:rPr>
+          <w:b/>
+          <w:color w:val="4F81BD" w:themeColor="accent1"/>
+          <w:vertAlign w:val="superscript"/>
+        </w:rPr>
+        <w:t>th</w:t>
+      </w:r>
+      <w:r>
+        <w:rPr>
+          <w:b/>
+          <w:color w:val="4F81BD" w:themeColor="accent1"/>
+        </w:rPr>
+        <w:t xml:space="preserve"> sep</w:t>
+      </w:r>
+      <w:proofErr w:type="gramStart"/>
+      <w:r>
+        <w:rPr>
+          <w:b/>
+          <w:color w:val="4F81BD" w:themeColor="accent1"/>
+        </w:rPr>
+        <w:t>,2026</w:t>
+      </w:r>
+      <w:proofErr w:type="gramEnd"/>
+    </w:p>
+    <w:p>
+      <w:pPr>
+        <w:rPr>
+          <w:color w:val="4F81BD" w:themeColor="accent1"/>
+        </w:rPr>
+      </w:pPr>
+      <w:r>
+        <w:rPr>
+          <w:color w:val="4F81BD" w:themeColor="accent1"/>
+        </w:rPr>
+        <w:t xml:space="preserve">    </w:t>
+      </w:r>
+    </w:p>
+    <w:p>
+      <w:pPr>
+        <w:rPr>
+          <w:color w:val="4F81BD" w:themeColor="accent1"/>
+        </w:rPr>
+      </w:pPr>
+      <w:r>
+        <w:rPr>
+          <w:color w:val="4F81BD" w:themeColor="accent1"/>
+        </w:rPr>
+        <w:t xml:space="preserve"> </w:t>
+      </w:r>
+    </w:p>
+    <w:p>
+      <w:pPr>
+        <w:rPr>
+          <w:b/>
+        </w:rPr>
+      </w:pPr>
+      <w:r>
+        <w:rPr>
+          <w:color w:val="4F81BD" w:themeColor="accent1"/>
+        </w:rPr>
+        <w:t xml:space="preserve"> </w:t>
+      </w:r>
+    </w:p>
+    <w:p>
+      <w:pPr>
+        <w:rPr>
+          <w:b/>
+        </w:rPr>
+      </w:pPr>
+      <w:r>
+        <w:rPr>
+          <w:b/>
+        </w:rPr>
+        <w:t xml:space="preserve">                </w:t>
+      </w:r>
+      <w:proofErr w:type="spellStart"/>
+      <w:r>
+        <w:rPr>
+          <w:b/>
+        </w:rPr>
+        <w:t>Entitiies</w:t>
+      </w:r>
+      <w:proofErr w:type="spellEnd"/>
+      <w:r>
+        <w:rPr>
+          <w:b/>
+        </w:rPr>
+        <w:t xml:space="preserve"> and code tag in the HTML:</w:t>
+      </w:r>
+    </w:p>
+    <w:p>
+      <w:pPr>
+        <w:rPr>
+          <w:b/>
+        </w:rPr>
+      </w:pPr>
+      <w:r>
+        <w:rPr>
+          <w:b/>
+        </w:rPr>
+        <w:t xml:space="preserve">                  </w:t>
+      </w:r>
+    </w:p>
+    <w:p>
+      <w:r>
+        <w:rPr>
+          <w:b/>
+        </w:rPr>
+        <w:t xml:space="preserve">                                                                         </w:t>
+      </w:r>
+      <w:r>
+        <w:t xml:space="preserve">Entities are used in the html to show the tags in the output </w:t>
+      </w:r>
+      <w:proofErr w:type="spellStart"/>
+      <w:r>
+        <w:t>e.g</w:t>
+      </w:r>
+      <w:proofErr w:type="spellEnd"/>
+      <w:r>
+        <w:t xml:space="preserve"> we write&lt;P&gt;this is me&lt;/P&gt; so it only show this is me in the output but if we want that the </w:t>
+      </w:r>
+      <w:proofErr w:type="spellStart"/>
+      <w:r>
+        <w:t>the</w:t>
+      </w:r>
+      <w:proofErr w:type="spellEnd"/>
+      <w:r>
+        <w:t xml:space="preserve"> </w:t>
+      </w:r>
+      <w:proofErr w:type="spellStart"/>
+      <w:r>
+        <w:t>parapgraph</w:t>
+      </w:r>
+      <w:proofErr w:type="spellEnd"/>
+      <w:r>
+        <w:t xml:space="preserve"> tag also come in the output so we use the entities.</w:t>
+      </w:r>
+    </w:p>
+    <w:p>
+      <w:r>
+        <w:rPr>
+          <w:b/>
+        </w:rPr>
+        <w:t>&amp;</w:t>
+      </w:r>
+      <w:proofErr w:type="spellStart"/>
+      <w:r>
+        <w:rPr>
+          <w:b/>
+        </w:rPr>
+        <w:t>It</w:t>
+      </w:r>
+      <w:proofErr w:type="gramStart"/>
+      <w:r>
+        <w:rPr>
+          <w:b/>
+        </w:rPr>
+        <w:t>;p</w:t>
+      </w:r>
+      <w:proofErr w:type="gramEnd"/>
+      <w:r>
+        <w:rPr>
+          <w:b/>
+        </w:rPr>
+        <w:t>&amp;gt</w:t>
+      </w:r>
+      <w:proofErr w:type="spellEnd"/>
+      <w:r>
+        <w:rPr>
+          <w:b/>
+        </w:rPr>
+        <w:t>;&amp;It;/</w:t>
+      </w:r>
+      <w:proofErr w:type="spellStart"/>
+      <w:r>
+        <w:rPr>
+          <w:b/>
+        </w:rPr>
+        <w:t>p&amp;gt</w:t>
+      </w:r>
+      <w:proofErr w:type="spellEnd"/>
+      <w:r>
+        <w:rPr>
+          <w:b/>
+        </w:rPr>
+        <w:t>;</w:t>
+      </w:r>
+      <w:r>
+        <w:t xml:space="preserve">  so this </w:t>
+      </w:r>
+      <w:proofErr w:type="spellStart"/>
+      <w:r>
+        <w:t>entitie</w:t>
+      </w:r>
+      <w:proofErr w:type="spellEnd"/>
+      <w:r>
+        <w:t xml:space="preserve"> is used to display the html tag of the paragraph.</w:t>
+      </w:r>
+    </w:p>
+    <w:p>
+      <w:r>
+        <w:rPr>
+          <w:b/>
+        </w:rPr>
+        <w:t>&amp;</w:t>
+      </w:r>
+      <w:proofErr w:type="spellStart"/>
+      <w:r>
+        <w:rPr>
+          <w:b/>
+        </w:rPr>
+        <w:t>nbsb</w:t>
+      </w:r>
+      <w:proofErr w:type="spellEnd"/>
+      <w:r>
+        <w:t xml:space="preserve"> is another tag </w:t>
+      </w:r>
+      <w:proofErr w:type="spellStart"/>
+      <w:r>
+        <w:t>entitie</w:t>
+      </w:r>
+      <w:proofErr w:type="spellEnd"/>
+      <w:r>
+        <w:t xml:space="preserve"> that is used for the spaces in the </w:t>
+      </w:r>
+      <w:proofErr w:type="gramStart"/>
+      <w:r>
+        <w:t>text .</w:t>
+      </w:r>
+      <w:proofErr w:type="gramEnd"/>
+    </w:p>
+    <w:p/>
+    <w:p>
+      <w:pPr>
+        <w:rPr>
+          <w:color w:val="000000" w:themeColor="text1"/>
+        </w:rPr>
+      </w:pPr>
       <w:bookmarkStart w:id="5" w:name="_GoBack"/>
       <w:bookmarkEnd w:id="5"/>
-    </w:p>
-    <w:p>
-      <w:pPr>
-        <w:rPr>
-          <w:color w:val="000000" w:themeColor="text1"/>
-        </w:rPr>
-      </w:pPr>
     </w:p>
     <w:sectPr>
       <w:pgSz w:w="11909" w:h="16834"/>
@@ -9665,7 +9957,7 @@
   </w:latentStyles>
   <w:style w:type="paragraph" w:default="1" w:styleId="Normal">
     <w:name w:val="Normal"/>
-    <w:rsid w:val="002037E5"/>
+    <w:rsid w:val="006B3D6D"/>
   </w:style>
   <w:style w:type="paragraph" w:styleId="Heading1">
     <w:name w:val="heading 1"/>

</xml_diff>